<commit_message>
Report: Analysis and Recommendation Phase
</commit_message>
<xml_diff>
--- a/Article Rough Draft.docx
+++ b/Article Rough Draft.docx
@@ -555,7 +555,7 @@
           </mc:Choice>
           <mc:Fallback>
             <w:pict>
-              <v:rect w14:anchorId="41470F53" id="Rectangle 3" o:spid="_x0000_s1026" style="position:absolute;margin-left:1.5pt;margin-top:3.75pt;width:48.5pt;height:283.5pt;z-index:251659264;visibility:visible;mso-wrap-style:square;mso-width-percent:0;mso-height-percent:0;mso-wrap-distance-left:9pt;mso-wrap-distance-top:0;mso-wrap-distance-right:9pt;mso-wrap-distance-bottom:0;mso-position-horizontal:absolute;mso-position-horizontal-relative:text;mso-position-vertical:absolute;mso-position-vertical-relative:text;mso-width-percent:0;mso-height-percent:0;mso-width-relative:margin;mso-height-relative:margin;v-text-anchor:middle" o:gfxdata="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" filled="f" strokecolor="#e00" strokeweight="2.25pt">
+              <v:rect w14:anchorId="5D4E016E" id="Rectangle 3" o:spid="_x0000_s1026" style="position:absolute;margin-left:1.5pt;margin-top:3.75pt;width:48.5pt;height:283.5pt;z-index:251659264;visibility:visible;mso-wrap-style:square;mso-width-percent:0;mso-height-percent:0;mso-wrap-distance-left:9pt;mso-wrap-distance-top:0;mso-wrap-distance-right:9pt;mso-wrap-distance-bottom:0;mso-position-horizontal:absolute;mso-position-horizontal-relative:text;mso-position-vertical:absolute;mso-position-vertical-relative:text;mso-width-percent:0;mso-height-percent:0;mso-width-relative:margin;mso-height-relative:margin;v-text-anchor:middle" o:gfxdata="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" filled="f" strokecolor="#e00" strokeweight="2.25pt">
                 <v:stroke joinstyle="round"/>
               </v:rect>
             </w:pict>
@@ -2133,7 +2133,7 @@
           <w:u w:val="single"/>
         </w:rPr>
         <w:lastRenderedPageBreak/>
-        <w:t>ANALYSIS</w:t>
+        <w:t>VISUALIZATIONS</w:t>
       </w:r>
     </w:p>
     <w:p>
@@ -2141,7 +2141,76 @@
         <w:tabs>
           <w:tab w:val="left" w:pos="2040"/>
         </w:tabs>
-        <w:jc w:val="center"/>
+      </w:pPr>
+      <w:r>
+        <w:t>Since we’re trying to scout potential talent for the team, we need to visualize the following:</w:t>
+      </w:r>
+    </w:p>
+    <w:p>
+      <w:pPr>
+        <w:pStyle w:val="ListParagraph"/>
+        <w:numPr>
+          <w:ilvl w:val="0"/>
+          <w:numId w:val="11"/>
+        </w:numPr>
+        <w:tabs>
+          <w:tab w:val="left" w:pos="2040"/>
+        </w:tabs>
+      </w:pPr>
+      <w:r>
+        <w:t>A global overview of the market</w:t>
+      </w:r>
+    </w:p>
+    <w:p>
+      <w:pPr>
+        <w:pStyle w:val="ListParagraph"/>
+        <w:numPr>
+          <w:ilvl w:val="0"/>
+          <w:numId w:val="11"/>
+        </w:numPr>
+        <w:tabs>
+          <w:tab w:val="left" w:pos="2040"/>
+        </w:tabs>
+      </w:pPr>
+      <w:r>
+        <w:t>A club financial overview and squad depth chart</w:t>
+      </w:r>
+    </w:p>
+    <w:p>
+      <w:pPr>
+        <w:pStyle w:val="ListParagraph"/>
+        <w:numPr>
+          <w:ilvl w:val="0"/>
+          <w:numId w:val="11"/>
+        </w:numPr>
+        <w:tabs>
+          <w:tab w:val="left" w:pos="2040"/>
+        </w:tabs>
+      </w:pPr>
+      <w:r>
+        <w:t>A way to identify “wonderkids” in the market and their stats</w:t>
+      </w:r>
+    </w:p>
+    <w:p>
+      <w:pPr>
+        <w:pStyle w:val="ListParagraph"/>
+        <w:numPr>
+          <w:ilvl w:val="0"/>
+          <w:numId w:val="11"/>
+        </w:numPr>
+        <w:tabs>
+          <w:tab w:val="left" w:pos="2040"/>
+        </w:tabs>
+      </w:pPr>
+      <w:r>
+        <w:t>A way to identify player’s who are underpaid and overvalued (regardless of age)</w:t>
+      </w:r>
+    </w:p>
+    <w:p>
+      <w:pPr>
+        <w:tabs>
+          <w:tab w:val="left" w:pos="2040"/>
+        </w:tabs>
         <w:rPr>
           <w:b/>
           <w:bCs/>
@@ -2158,7 +2227,34 @@
           <w:szCs w:val="28"/>
           <w:u w:val="single"/>
         </w:rPr>
-        <w:t>&amp; VISUALIZATIONS</w:t>
+        <w:t>Global Overview</w:t>
+      </w:r>
+      <w:r>
+        <w:rPr>
+          <w:b/>
+          <w:bCs/>
+          <w:sz w:val="28"/>
+          <w:szCs w:val="28"/>
+        </w:rPr>
+        <w:t xml:space="preserve"> </w:t>
+      </w:r>
+      <w:r>
+        <w:rPr>
+          <w:i/>
+          <w:iCs/>
+          <w:sz w:val="28"/>
+          <w:szCs w:val="28"/>
+        </w:rPr>
+        <w:t xml:space="preserve">– page </w:t>
+      </w:r>
+      <w:r>
+        <w:rPr>
+          <w:i/>
+          <w:iCs/>
+          <w:sz w:val="28"/>
+          <w:szCs w:val="28"/>
+        </w:rPr>
+        <w:t>1</w:t>
       </w:r>
     </w:p>
     <w:p>
@@ -2166,7 +2262,1477 @@
         <w:tabs>
           <w:tab w:val="left" w:pos="2040"/>
         </w:tabs>
-      </w:pPr>
+        <w:rPr>
+          <w:sz w:val="28"/>
+          <w:szCs w:val="28"/>
+        </w:rPr>
+      </w:pPr>
+      <w:r>
+        <w:rPr>
+          <w:sz w:val="28"/>
+          <w:szCs w:val="28"/>
+        </w:rPr>
+        <w:drawing>
+          <wp:inline distT="0" distB="0" distL="0" distR="0" wp14:anchorId="3C4174E9" wp14:editId="7AD350F2">
+            <wp:extent cx="5731510" cy="3244215"/>
+            <wp:effectExtent l="0" t="0" r="2540" b="0"/>
+            <wp:docPr id="143223350" name="Picture 1"/>
+            <wp:cNvGraphicFramePr>
+              <a:graphicFrameLocks xmlns:a="http://schemas.openxmlformats.org/drawingml/2006/main" noChangeAspect="1"/>
+            </wp:cNvGraphicFramePr>
+            <a:graphic xmlns:a="http://schemas.openxmlformats.org/drawingml/2006/main">
+              <a:graphicData uri="http://schemas.openxmlformats.org/drawingml/2006/picture">
+                <pic:pic xmlns:pic="http://schemas.openxmlformats.org/drawingml/2006/picture">
+                  <pic:nvPicPr>
+                    <pic:cNvPr id="143223350" name=""/>
+                    <pic:cNvPicPr/>
+                  </pic:nvPicPr>
+                  <pic:blipFill>
+                    <a:blip r:embed="rId19"/>
+                    <a:stretch>
+                      <a:fillRect/>
+                    </a:stretch>
+                  </pic:blipFill>
+                  <pic:spPr>
+                    <a:xfrm>
+                      <a:off x="0" y="0"/>
+                      <a:ext cx="5731510" cy="3244215"/>
+                    </a:xfrm>
+                    <a:prstGeom prst="rect">
+                      <a:avLst/>
+                    </a:prstGeom>
+                  </pic:spPr>
+                </pic:pic>
+              </a:graphicData>
+            </a:graphic>
+          </wp:inline>
+        </w:drawing>
+      </w:r>
+    </w:p>
+    <w:p>
+      <w:pPr>
+        <w:tabs>
+          <w:tab w:val="left" w:pos="2040"/>
+        </w:tabs>
+      </w:pPr>
+      <w:r>
+        <w:t>This page showcases the following:</w:t>
+      </w:r>
+    </w:p>
+    <w:p>
+      <w:pPr>
+        <w:pStyle w:val="ListParagraph"/>
+        <w:numPr>
+          <w:ilvl w:val="0"/>
+          <w:numId w:val="12"/>
+        </w:numPr>
+        <w:tabs>
+          <w:tab w:val="left" w:pos="2040"/>
+        </w:tabs>
+      </w:pPr>
+      <w:r>
+        <w:t>Top left (L to R): The number of players in all leagues, total market value and the average player wage across all positions</w:t>
+      </w:r>
+    </w:p>
+    <w:p>
+      <w:pPr>
+        <w:pStyle w:val="ListParagraph"/>
+        <w:numPr>
+          <w:ilvl w:val="0"/>
+          <w:numId w:val="12"/>
+        </w:numPr>
+        <w:tabs>
+          <w:tab w:val="left" w:pos="2040"/>
+        </w:tabs>
+      </w:pPr>
+      <w:r>
+        <w:t>Bottom left: A</w:t>
+      </w:r>
+      <w:r>
+        <w:t>n interactable</w:t>
+      </w:r>
+      <w:r>
+        <w:t xml:space="preserve"> donut chart showcasing the distribution of players and their positions in the market, making up the 18,85k players.</w:t>
+      </w:r>
+      <w:r>
+        <w:t xml:space="preserve"> Selecting a segment filters the data for that position, affecting the other visuals.</w:t>
+      </w:r>
+    </w:p>
+    <w:p>
+      <w:pPr>
+        <w:pStyle w:val="ListParagraph"/>
+        <w:numPr>
+          <w:ilvl w:val="0"/>
+          <w:numId w:val="12"/>
+        </w:numPr>
+        <w:tabs>
+          <w:tab w:val="left" w:pos="2040"/>
+        </w:tabs>
+      </w:pPr>
+      <w:r>
+        <w:t xml:space="preserve">Right: A table showcasing the top 10 clubs by total player value. </w:t>
+      </w:r>
+    </w:p>
+    <w:p>
+      <w:pPr>
+        <w:tabs>
+          <w:tab w:val="left" w:pos="2040"/>
+        </w:tabs>
+        <w:rPr>
+          <w:sz w:val="28"/>
+          <w:szCs w:val="28"/>
+        </w:rPr>
+      </w:pPr>
+    </w:p>
+    <w:p>
+      <w:pPr>
+        <w:tabs>
+          <w:tab w:val="left" w:pos="2040"/>
+        </w:tabs>
+        <w:rPr>
+          <w:sz w:val="28"/>
+          <w:szCs w:val="28"/>
+        </w:rPr>
+      </w:pPr>
+    </w:p>
+    <w:p>
+      <w:pPr>
+        <w:tabs>
+          <w:tab w:val="left" w:pos="2040"/>
+        </w:tabs>
+        <w:rPr>
+          <w:sz w:val="28"/>
+          <w:szCs w:val="28"/>
+        </w:rPr>
+      </w:pPr>
+    </w:p>
+    <w:p>
+      <w:pPr>
+        <w:tabs>
+          <w:tab w:val="left" w:pos="2040"/>
+        </w:tabs>
+        <w:rPr>
+          <w:b/>
+          <w:bCs/>
+          <w:sz w:val="28"/>
+          <w:szCs w:val="28"/>
+          <w:u w:val="single"/>
+        </w:rPr>
+      </w:pPr>
+    </w:p>
+    <w:p>
+      <w:pPr>
+        <w:tabs>
+          <w:tab w:val="left" w:pos="2040"/>
+        </w:tabs>
+        <w:rPr>
+          <w:sz w:val="28"/>
+          <w:szCs w:val="28"/>
+        </w:rPr>
+      </w:pPr>
+      <w:r>
+        <w:rPr>
+          <w:b/>
+          <w:bCs/>
+          <w:sz w:val="28"/>
+          <w:szCs w:val="28"/>
+          <w:u w:val="single"/>
+        </w:rPr>
+        <w:lastRenderedPageBreak/>
+        <w:t>Club Financial &amp; Club Depth Inspection</w:t>
+      </w:r>
+      <w:r>
+        <w:rPr>
+          <w:b/>
+          <w:bCs/>
+          <w:sz w:val="28"/>
+          <w:szCs w:val="28"/>
+        </w:rPr>
+        <w:t xml:space="preserve"> </w:t>
+      </w:r>
+      <w:r>
+        <w:rPr>
+          <w:i/>
+          <w:iCs/>
+          <w:sz w:val="28"/>
+          <w:szCs w:val="28"/>
+        </w:rPr>
+        <w:t>– page</w:t>
+      </w:r>
+      <w:r>
+        <w:rPr>
+          <w:i/>
+          <w:iCs/>
+          <w:sz w:val="28"/>
+          <w:szCs w:val="28"/>
+        </w:rPr>
+        <w:t>s</w:t>
+      </w:r>
+      <w:r>
+        <w:rPr>
+          <w:i/>
+          <w:iCs/>
+          <w:sz w:val="28"/>
+          <w:szCs w:val="28"/>
+        </w:rPr>
+        <w:t xml:space="preserve"> </w:t>
+      </w:r>
+      <w:r>
+        <w:rPr>
+          <w:i/>
+          <w:iCs/>
+          <w:sz w:val="28"/>
+          <w:szCs w:val="28"/>
+        </w:rPr>
+        <w:t>2 &amp; 3</w:t>
+      </w:r>
+    </w:p>
+    <w:p>
+      <w:pPr>
+        <w:tabs>
+          <w:tab w:val="left" w:pos="2040"/>
+        </w:tabs>
+      </w:pPr>
+      <w:r>
+        <w:drawing>
+          <wp:inline distT="0" distB="0" distL="0" distR="0" wp14:anchorId="1423A0E3" wp14:editId="58F090F5">
+            <wp:extent cx="5731510" cy="3095625"/>
+            <wp:effectExtent l="0" t="0" r="2540" b="9525"/>
+            <wp:docPr id="1535812902" name="Picture 1"/>
+            <wp:cNvGraphicFramePr>
+              <a:graphicFrameLocks xmlns:a="http://schemas.openxmlformats.org/drawingml/2006/main" noChangeAspect="1"/>
+            </wp:cNvGraphicFramePr>
+            <a:graphic xmlns:a="http://schemas.openxmlformats.org/drawingml/2006/main">
+              <a:graphicData uri="http://schemas.openxmlformats.org/drawingml/2006/picture">
+                <pic:pic xmlns:pic="http://schemas.openxmlformats.org/drawingml/2006/picture">
+                  <pic:nvPicPr>
+                    <pic:cNvPr id="1535812902" name=""/>
+                    <pic:cNvPicPr/>
+                  </pic:nvPicPr>
+                  <pic:blipFill>
+                    <a:blip r:embed="rId20"/>
+                    <a:stretch>
+                      <a:fillRect/>
+                    </a:stretch>
+                  </pic:blipFill>
+                  <pic:spPr>
+                    <a:xfrm>
+                      <a:off x="0" y="0"/>
+                      <a:ext cx="5731510" cy="3095625"/>
+                    </a:xfrm>
+                    <a:prstGeom prst="rect">
+                      <a:avLst/>
+                    </a:prstGeom>
+                  </pic:spPr>
+                </pic:pic>
+              </a:graphicData>
+            </a:graphic>
+          </wp:inline>
+        </w:drawing>
+      </w:r>
+    </w:p>
+    <w:p>
+      <w:pPr>
+        <w:tabs>
+          <w:tab w:val="left" w:pos="2040"/>
+        </w:tabs>
+      </w:pPr>
+      <w:r>
+        <w:t>Th</w:t>
+      </w:r>
+      <w:r>
+        <w:t>is</w:t>
+      </w:r>
+      <w:r>
+        <w:t xml:space="preserve"> page shows:</w:t>
+      </w:r>
+    </w:p>
+    <w:p>
+      <w:pPr>
+        <w:pStyle w:val="ListParagraph"/>
+        <w:numPr>
+          <w:ilvl w:val="0"/>
+          <w:numId w:val="13"/>
+        </w:numPr>
+        <w:tabs>
+          <w:tab w:val="left" w:pos="2040"/>
+        </w:tabs>
+      </w:pPr>
+      <w:r>
+        <w:t>Left: A searchable slicer with club names, that filters the visuals by the selected club.</w:t>
+      </w:r>
+    </w:p>
+    <w:p>
+      <w:pPr>
+        <w:pStyle w:val="ListParagraph"/>
+        <w:numPr>
+          <w:ilvl w:val="0"/>
+          <w:numId w:val="13"/>
+        </w:numPr>
+        <w:tabs>
+          <w:tab w:val="left" w:pos="2040"/>
+        </w:tabs>
+      </w:pPr>
+      <w:r>
+        <w:t>Middle: A bar chart showing the total amount that Newcastle United spends in wages (measured in Euros)</w:t>
+      </w:r>
+    </w:p>
+    <w:p>
+      <w:pPr>
+        <w:pStyle w:val="ListParagraph"/>
+        <w:numPr>
+          <w:ilvl w:val="0"/>
+          <w:numId w:val="13"/>
+        </w:numPr>
+        <w:tabs>
+          <w:tab w:val="left" w:pos="2040"/>
+        </w:tabs>
+      </w:pPr>
+      <w:r>
+        <w:t xml:space="preserve">Top Right (L to R): The average wage of a player at the club, as well as the total player value of </w:t>
+      </w:r>
+      <w:r>
+        <w:t>a club</w:t>
+      </w:r>
+      <w:r>
+        <w:t>.</w:t>
+      </w:r>
+    </w:p>
+    <w:p>
+      <w:pPr>
+        <w:pStyle w:val="ListParagraph"/>
+        <w:numPr>
+          <w:ilvl w:val="0"/>
+          <w:numId w:val="13"/>
+        </w:numPr>
+        <w:tabs>
+          <w:tab w:val="left" w:pos="2040"/>
+        </w:tabs>
+      </w:pPr>
+      <w:r>
+        <w:t>Bottom Right: A</w:t>
+      </w:r>
+      <w:r>
+        <w:t>n interactable</w:t>
+      </w:r>
+      <w:r>
+        <w:t xml:space="preserve"> donut chart illustrating the wage distribution by player position.</w:t>
+      </w:r>
+      <w:r>
+        <w:t xml:space="preserve"> Selecting a position affects the other visuals to showcase the data for only that position.</w:t>
+      </w:r>
+    </w:p>
+    <w:p>
+      <w:pPr>
+        <w:tabs>
+          <w:tab w:val="left" w:pos="2040"/>
+        </w:tabs>
+      </w:pPr>
+      <w:r>
+        <w:t>This graph can help in budget forecasting and understanding budget constraints, alongside where the wiggle room resides in the budget as well.</w:t>
+      </w:r>
+    </w:p>
+    <w:p>
+      <w:pPr>
+        <w:tabs>
+          <w:tab w:val="left" w:pos="2040"/>
+        </w:tabs>
+      </w:pPr>
+    </w:p>
+    <w:p>
+      <w:pPr>
+        <w:tabs>
+          <w:tab w:val="left" w:pos="2040"/>
+        </w:tabs>
+      </w:pPr>
+    </w:p>
+    <w:p>
+      <w:pPr>
+        <w:tabs>
+          <w:tab w:val="left" w:pos="2040"/>
+        </w:tabs>
+      </w:pPr>
+    </w:p>
+    <w:p>
+      <w:pPr>
+        <w:tabs>
+          <w:tab w:val="left" w:pos="2040"/>
+        </w:tabs>
+      </w:pPr>
+    </w:p>
+    <w:p>
+      <w:pPr>
+        <w:tabs>
+          <w:tab w:val="left" w:pos="2040"/>
+        </w:tabs>
+      </w:pPr>
+    </w:p>
+    <w:p>
+      <w:pPr>
+        <w:tabs>
+          <w:tab w:val="left" w:pos="2040"/>
+        </w:tabs>
+      </w:pPr>
+    </w:p>
+    <w:p>
+      <w:pPr>
+        <w:tabs>
+          <w:tab w:val="left" w:pos="2040"/>
+        </w:tabs>
+      </w:pPr>
+      <w:r>
+        <w:lastRenderedPageBreak/>
+        <w:drawing>
+          <wp:inline distT="0" distB="0" distL="0" distR="0" wp14:anchorId="56924A71" wp14:editId="613B360E">
+            <wp:extent cx="5731510" cy="3315970"/>
+            <wp:effectExtent l="0" t="0" r="2540" b="0"/>
+            <wp:docPr id="1687864893" name="Picture 1"/>
+            <wp:cNvGraphicFramePr>
+              <a:graphicFrameLocks xmlns:a="http://schemas.openxmlformats.org/drawingml/2006/main" noChangeAspect="1"/>
+            </wp:cNvGraphicFramePr>
+            <a:graphic xmlns:a="http://schemas.openxmlformats.org/drawingml/2006/main">
+              <a:graphicData uri="http://schemas.openxmlformats.org/drawingml/2006/picture">
+                <pic:pic xmlns:pic="http://schemas.openxmlformats.org/drawingml/2006/picture">
+                  <pic:nvPicPr>
+                    <pic:cNvPr id="1687864893" name=""/>
+                    <pic:cNvPicPr/>
+                  </pic:nvPicPr>
+                  <pic:blipFill>
+                    <a:blip r:embed="rId21"/>
+                    <a:stretch>
+                      <a:fillRect/>
+                    </a:stretch>
+                  </pic:blipFill>
+                  <pic:spPr>
+                    <a:xfrm>
+                      <a:off x="0" y="0"/>
+                      <a:ext cx="5731510" cy="3315970"/>
+                    </a:xfrm>
+                    <a:prstGeom prst="rect">
+                      <a:avLst/>
+                    </a:prstGeom>
+                  </pic:spPr>
+                </pic:pic>
+              </a:graphicData>
+            </a:graphic>
+          </wp:inline>
+        </w:drawing>
+      </w:r>
+    </w:p>
+    <w:p>
+      <w:pPr>
+        <w:tabs>
+          <w:tab w:val="left" w:pos="2040"/>
+        </w:tabs>
+      </w:pPr>
+      <w:r>
+        <w:t>The page shows</w:t>
+      </w:r>
+      <w:r>
+        <w:t>:</w:t>
+      </w:r>
+    </w:p>
+    <w:p>
+      <w:pPr>
+        <w:pStyle w:val="ListParagraph"/>
+        <w:numPr>
+          <w:ilvl w:val="0"/>
+          <w:numId w:val="15"/>
+        </w:numPr>
+        <w:tabs>
+          <w:tab w:val="left" w:pos="2040"/>
+        </w:tabs>
+      </w:pPr>
+      <w:r>
+        <w:t xml:space="preserve">Top </w:t>
+      </w:r>
+      <w:r>
+        <w:t xml:space="preserve">Left: </w:t>
+      </w:r>
+      <w:r>
+        <w:t>A searchable slicer with club names, that filters the visuals by the selected club.</w:t>
+      </w:r>
+    </w:p>
+    <w:p>
+      <w:pPr>
+        <w:pStyle w:val="ListParagraph"/>
+        <w:numPr>
+          <w:ilvl w:val="0"/>
+          <w:numId w:val="15"/>
+        </w:numPr>
+        <w:tabs>
+          <w:tab w:val="left" w:pos="2040"/>
+        </w:tabs>
+      </w:pPr>
+      <w:r>
+        <w:t>Bottom Left: A card showing the total number of players in the selected club.</w:t>
+      </w:r>
+    </w:p>
+    <w:p>
+      <w:pPr>
+        <w:pStyle w:val="ListParagraph"/>
+        <w:numPr>
+          <w:ilvl w:val="0"/>
+          <w:numId w:val="15"/>
+        </w:numPr>
+        <w:tabs>
+          <w:tab w:val="left" w:pos="2040"/>
+        </w:tabs>
+      </w:pPr>
+      <w:r>
+        <w:t xml:space="preserve">Top </w:t>
+      </w:r>
+      <w:r>
+        <w:t xml:space="preserve">Right: A stacked column chart indicating </w:t>
+      </w:r>
+      <w:r>
+        <w:t>the number of players that are present for every position recorded</w:t>
+      </w:r>
+      <w:r>
+        <w:t xml:space="preserve"> in the selected club</w:t>
+      </w:r>
+      <w:r>
+        <w:t xml:space="preserve">. </w:t>
+      </w:r>
+    </w:p>
+    <w:p>
+      <w:pPr>
+        <w:pStyle w:val="ListParagraph"/>
+        <w:numPr>
+          <w:ilvl w:val="0"/>
+          <w:numId w:val="15"/>
+        </w:numPr>
+        <w:tabs>
+          <w:tab w:val="left" w:pos="2040"/>
+        </w:tabs>
+      </w:pPr>
+      <w:r>
+        <w:t>Bottom Right: A table showing the players in the club selected alongside some information (such as age, positions, value and wages)</w:t>
+      </w:r>
+    </w:p>
+    <w:p>
+      <w:pPr>
+        <w:tabs>
+          <w:tab w:val="left" w:pos="2040"/>
+        </w:tabs>
+      </w:pPr>
+      <w:r>
+        <w:t>This will be useful in determining which areas require more player</w:t>
+      </w:r>
+      <w:r>
+        <w:t>s.</w:t>
+      </w:r>
+    </w:p>
+    <w:p>
+      <w:pPr>
+        <w:tabs>
+          <w:tab w:val="left" w:pos="2040"/>
+        </w:tabs>
+        <w:rPr>
+          <w:b/>
+          <w:bCs/>
+          <w:sz w:val="28"/>
+          <w:szCs w:val="28"/>
+          <w:u w:val="single"/>
+        </w:rPr>
+      </w:pPr>
+    </w:p>
+    <w:p>
+      <w:pPr>
+        <w:tabs>
+          <w:tab w:val="left" w:pos="2040"/>
+        </w:tabs>
+        <w:rPr>
+          <w:b/>
+          <w:bCs/>
+          <w:sz w:val="28"/>
+          <w:szCs w:val="28"/>
+          <w:u w:val="single"/>
+        </w:rPr>
+      </w:pPr>
+    </w:p>
+    <w:p>
+      <w:pPr>
+        <w:tabs>
+          <w:tab w:val="left" w:pos="2040"/>
+        </w:tabs>
+        <w:rPr>
+          <w:b/>
+          <w:bCs/>
+          <w:sz w:val="28"/>
+          <w:szCs w:val="28"/>
+          <w:u w:val="single"/>
+        </w:rPr>
+      </w:pPr>
+    </w:p>
+    <w:p>
+      <w:pPr>
+        <w:tabs>
+          <w:tab w:val="left" w:pos="2040"/>
+        </w:tabs>
+        <w:rPr>
+          <w:b/>
+          <w:bCs/>
+          <w:sz w:val="28"/>
+          <w:szCs w:val="28"/>
+          <w:u w:val="single"/>
+        </w:rPr>
+      </w:pPr>
+    </w:p>
+    <w:p>
+      <w:pPr>
+        <w:tabs>
+          <w:tab w:val="left" w:pos="2040"/>
+        </w:tabs>
+        <w:rPr>
+          <w:b/>
+          <w:bCs/>
+          <w:sz w:val="28"/>
+          <w:szCs w:val="28"/>
+          <w:u w:val="single"/>
+        </w:rPr>
+      </w:pPr>
+    </w:p>
+    <w:p>
+      <w:pPr>
+        <w:tabs>
+          <w:tab w:val="left" w:pos="2040"/>
+        </w:tabs>
+        <w:rPr>
+          <w:b/>
+          <w:bCs/>
+          <w:sz w:val="28"/>
+          <w:szCs w:val="28"/>
+          <w:u w:val="single"/>
+        </w:rPr>
+      </w:pPr>
+    </w:p>
+    <w:p>
+      <w:pPr>
+        <w:tabs>
+          <w:tab w:val="left" w:pos="2040"/>
+        </w:tabs>
+        <w:rPr>
+          <w:b/>
+          <w:bCs/>
+          <w:sz w:val="28"/>
+          <w:szCs w:val="28"/>
+          <w:u w:val="single"/>
+        </w:rPr>
+      </w:pPr>
+    </w:p>
+    <w:p>
+      <w:pPr>
+        <w:tabs>
+          <w:tab w:val="left" w:pos="2040"/>
+        </w:tabs>
+        <w:rPr>
+          <w:b/>
+          <w:bCs/>
+          <w:sz w:val="28"/>
+          <w:szCs w:val="28"/>
+          <w:u w:val="single"/>
+        </w:rPr>
+      </w:pPr>
+    </w:p>
+    <w:p>
+      <w:pPr>
+        <w:tabs>
+          <w:tab w:val="left" w:pos="2040"/>
+        </w:tabs>
+        <w:rPr>
+          <w:b/>
+          <w:bCs/>
+          <w:sz w:val="28"/>
+          <w:szCs w:val="28"/>
+          <w:u w:val="single"/>
+        </w:rPr>
+      </w:pPr>
+    </w:p>
+    <w:p>
+      <w:pPr>
+        <w:tabs>
+          <w:tab w:val="left" w:pos="2040"/>
+        </w:tabs>
+        <w:rPr>
+          <w:i/>
+          <w:iCs/>
+          <w:sz w:val="28"/>
+          <w:szCs w:val="28"/>
+        </w:rPr>
+      </w:pPr>
+      <w:r>
+        <w:rPr>
+          <w:b/>
+          <w:bCs/>
+          <w:sz w:val="28"/>
+          <w:szCs w:val="28"/>
+          <w:u w:val="single"/>
+        </w:rPr>
+        <w:lastRenderedPageBreak/>
+        <w:t>Wonderkid Scouting</w:t>
+      </w:r>
+      <w:r>
+        <w:rPr>
+          <w:sz w:val="28"/>
+          <w:szCs w:val="28"/>
+        </w:rPr>
+        <w:t xml:space="preserve"> </w:t>
+      </w:r>
+      <w:r>
+        <w:rPr>
+          <w:i/>
+          <w:iCs/>
+          <w:sz w:val="28"/>
+          <w:szCs w:val="28"/>
+        </w:rPr>
+        <w:t>– page 4</w:t>
+      </w:r>
+    </w:p>
+    <w:p>
+      <w:pPr>
+        <w:tabs>
+          <w:tab w:val="left" w:pos="2040"/>
+        </w:tabs>
+        <w:rPr>
+          <w:b/>
+          <w:bCs/>
+          <w:sz w:val="28"/>
+          <w:szCs w:val="28"/>
+          <w:u w:val="single"/>
+        </w:rPr>
+      </w:pPr>
+      <w:r>
+        <w:rPr>
+          <w:b/>
+          <w:bCs/>
+          <w:sz w:val="28"/>
+          <w:szCs w:val="28"/>
+          <w:u w:val="single"/>
+        </w:rPr>
+        <w:drawing>
+          <wp:inline distT="0" distB="0" distL="0" distR="0" wp14:anchorId="502EE3BB" wp14:editId="5062F9FE">
+            <wp:extent cx="5731510" cy="3217545"/>
+            <wp:effectExtent l="0" t="0" r="2540" b="1905"/>
+            <wp:docPr id="602612157" name="Picture 1"/>
+            <wp:cNvGraphicFramePr>
+              <a:graphicFrameLocks xmlns:a="http://schemas.openxmlformats.org/drawingml/2006/main" noChangeAspect="1"/>
+            </wp:cNvGraphicFramePr>
+            <a:graphic xmlns:a="http://schemas.openxmlformats.org/drawingml/2006/main">
+              <a:graphicData uri="http://schemas.openxmlformats.org/drawingml/2006/picture">
+                <pic:pic xmlns:pic="http://schemas.openxmlformats.org/drawingml/2006/picture">
+                  <pic:nvPicPr>
+                    <pic:cNvPr id="602612157" name=""/>
+                    <pic:cNvPicPr/>
+                  </pic:nvPicPr>
+                  <pic:blipFill>
+                    <a:blip r:embed="rId22"/>
+                    <a:stretch>
+                      <a:fillRect/>
+                    </a:stretch>
+                  </pic:blipFill>
+                  <pic:spPr>
+                    <a:xfrm>
+                      <a:off x="0" y="0"/>
+                      <a:ext cx="5731510" cy="3217545"/>
+                    </a:xfrm>
+                    <a:prstGeom prst="rect">
+                      <a:avLst/>
+                    </a:prstGeom>
+                  </pic:spPr>
+                </pic:pic>
+              </a:graphicData>
+            </a:graphic>
+          </wp:inline>
+        </w:drawing>
+      </w:r>
+    </w:p>
+    <w:p>
+      <w:pPr>
+        <w:pStyle w:val="ListParagraph"/>
+        <w:numPr>
+          <w:ilvl w:val="0"/>
+          <w:numId w:val="16"/>
+        </w:numPr>
+      </w:pPr>
+      <w:r>
+        <w:t xml:space="preserve">Left: A scatter plot </w:t>
+      </w:r>
+      <w:r>
+        <w:t>demonstrat</w:t>
+      </w:r>
+      <w:r>
+        <w:t>ing</w:t>
+      </w:r>
+      <w:r>
+        <w:t xml:space="preserve"> the potential and current value of players aged between 16 and 21. The size of data points illustrate the growth that player could experience. Each data point has the player’s information (Name, Age, Current Club, Value, Best Position, Other Positions). </w:t>
+      </w:r>
+    </w:p>
+    <w:p>
+      <w:pPr>
+        <w:pStyle w:val="ListParagraph"/>
+        <w:numPr>
+          <w:ilvl w:val="0"/>
+          <w:numId w:val="16"/>
+        </w:numPr>
+      </w:pPr>
+      <w:r>
+        <w:t xml:space="preserve">Right: </w:t>
+      </w:r>
+      <w:r>
+        <w:t>A slicer that filter’s data by a player’s best position</w:t>
+      </w:r>
+    </w:p>
+    <w:p>
+      <w:r>
+        <w:t>Useful in identifying potential major talent early whilst they are valued at affordable options.</w:t>
+      </w:r>
+    </w:p>
+    <w:p>
+      <w:pPr>
+        <w:rPr>
+          <w:b/>
+          <w:bCs/>
+          <w:sz w:val="28"/>
+          <w:szCs w:val="28"/>
+          <w:u w:val="single"/>
+        </w:rPr>
+      </w:pPr>
+    </w:p>
+    <w:p>
+      <w:pPr>
+        <w:rPr>
+          <w:b/>
+          <w:bCs/>
+          <w:sz w:val="28"/>
+          <w:szCs w:val="28"/>
+          <w:u w:val="single"/>
+        </w:rPr>
+      </w:pPr>
+    </w:p>
+    <w:p>
+      <w:pPr>
+        <w:rPr>
+          <w:b/>
+          <w:bCs/>
+          <w:sz w:val="28"/>
+          <w:szCs w:val="28"/>
+          <w:u w:val="single"/>
+        </w:rPr>
+      </w:pPr>
+    </w:p>
+    <w:p>
+      <w:pPr>
+        <w:rPr>
+          <w:b/>
+          <w:bCs/>
+          <w:sz w:val="28"/>
+          <w:szCs w:val="28"/>
+          <w:u w:val="single"/>
+        </w:rPr>
+      </w:pPr>
+    </w:p>
+    <w:p>
+      <w:pPr>
+        <w:rPr>
+          <w:b/>
+          <w:bCs/>
+          <w:sz w:val="28"/>
+          <w:szCs w:val="28"/>
+          <w:u w:val="single"/>
+        </w:rPr>
+      </w:pPr>
+    </w:p>
+    <w:p>
+      <w:pPr>
+        <w:rPr>
+          <w:b/>
+          <w:bCs/>
+          <w:sz w:val="28"/>
+          <w:szCs w:val="28"/>
+          <w:u w:val="single"/>
+        </w:rPr>
+      </w:pPr>
+    </w:p>
+    <w:p>
+      <w:pPr>
+        <w:rPr>
+          <w:b/>
+          <w:bCs/>
+          <w:sz w:val="28"/>
+          <w:szCs w:val="28"/>
+          <w:u w:val="single"/>
+        </w:rPr>
+      </w:pPr>
+    </w:p>
+    <w:p>
+      <w:pPr>
+        <w:rPr>
+          <w:b/>
+          <w:bCs/>
+          <w:sz w:val="28"/>
+          <w:szCs w:val="28"/>
+          <w:u w:val="single"/>
+        </w:rPr>
+      </w:pPr>
+    </w:p>
+    <w:p>
+      <w:pPr>
+        <w:rPr>
+          <w:b/>
+          <w:bCs/>
+          <w:sz w:val="28"/>
+          <w:szCs w:val="28"/>
+          <w:u w:val="single"/>
+        </w:rPr>
+      </w:pPr>
+    </w:p>
+    <w:p>
+      <w:pPr>
+        <w:rPr>
+          <w:i/>
+          <w:iCs/>
+          <w:sz w:val="28"/>
+          <w:szCs w:val="28"/>
+        </w:rPr>
+      </w:pPr>
+      <w:r>
+        <w:rPr>
+          <w:b/>
+          <w:bCs/>
+          <w:sz w:val="28"/>
+          <w:szCs w:val="28"/>
+          <w:u w:val="single"/>
+        </w:rPr>
+        <w:lastRenderedPageBreak/>
+        <w:t>Player Stat Analysis</w:t>
+      </w:r>
+      <w:r>
+        <w:rPr>
+          <w:sz w:val="28"/>
+          <w:szCs w:val="28"/>
+        </w:rPr>
+        <w:t xml:space="preserve"> </w:t>
+      </w:r>
+      <w:r>
+        <w:rPr>
+          <w:i/>
+          <w:iCs/>
+          <w:sz w:val="28"/>
+          <w:szCs w:val="28"/>
+        </w:rPr>
+        <w:t xml:space="preserve">– page </w:t>
+      </w:r>
+      <w:r>
+        <w:rPr>
+          <w:i/>
+          <w:iCs/>
+          <w:sz w:val="28"/>
+          <w:szCs w:val="28"/>
+        </w:rPr>
+        <w:t>5</w:t>
+      </w:r>
+    </w:p>
+    <w:p>
+      <w:pPr>
+        <w:rPr>
+          <w:b/>
+          <w:bCs/>
+          <w:sz w:val="28"/>
+          <w:szCs w:val="28"/>
+          <w:u w:val="single"/>
+        </w:rPr>
+      </w:pPr>
+      <w:r>
+        <w:rPr>
+          <w:b/>
+          <w:bCs/>
+          <w:sz w:val="28"/>
+          <w:szCs w:val="28"/>
+          <w:u w:val="single"/>
+        </w:rPr>
+        <w:drawing>
+          <wp:inline distT="0" distB="0" distL="0" distR="0" wp14:anchorId="38DE9386" wp14:editId="2D321C4B">
+            <wp:extent cx="5731510" cy="3444240"/>
+            <wp:effectExtent l="0" t="0" r="2540" b="3810"/>
+            <wp:docPr id="1139163982" name="Picture 1"/>
+            <wp:cNvGraphicFramePr>
+              <a:graphicFrameLocks xmlns:a="http://schemas.openxmlformats.org/drawingml/2006/main" noChangeAspect="1"/>
+            </wp:cNvGraphicFramePr>
+            <a:graphic xmlns:a="http://schemas.openxmlformats.org/drawingml/2006/main">
+              <a:graphicData uri="http://schemas.openxmlformats.org/drawingml/2006/picture">
+                <pic:pic xmlns:pic="http://schemas.openxmlformats.org/drawingml/2006/picture">
+                  <pic:nvPicPr>
+                    <pic:cNvPr id="1139163982" name=""/>
+                    <pic:cNvPicPr/>
+                  </pic:nvPicPr>
+                  <pic:blipFill>
+                    <a:blip r:embed="rId23"/>
+                    <a:stretch>
+                      <a:fillRect/>
+                    </a:stretch>
+                  </pic:blipFill>
+                  <pic:spPr>
+                    <a:xfrm>
+                      <a:off x="0" y="0"/>
+                      <a:ext cx="5731510" cy="3444240"/>
+                    </a:xfrm>
+                    <a:prstGeom prst="rect">
+                      <a:avLst/>
+                    </a:prstGeom>
+                  </pic:spPr>
+                </pic:pic>
+              </a:graphicData>
+            </a:graphic>
+          </wp:inline>
+        </w:drawing>
+      </w:r>
+    </w:p>
+    <w:p>
+      <w:r>
+        <w:t xml:space="preserve">This page </w:t>
+      </w:r>
+      <w:r>
+        <w:t>shows</w:t>
+      </w:r>
+      <w:r>
+        <w:t>:</w:t>
+      </w:r>
+    </w:p>
+    <w:p>
+      <w:pPr>
+        <w:pStyle w:val="ListParagraph"/>
+        <w:numPr>
+          <w:ilvl w:val="0"/>
+          <w:numId w:val="14"/>
+        </w:numPr>
+      </w:pPr>
+      <w:r>
+        <w:t>Left: A searchable slicer for players in the market. Filters all other visuals on the page.</w:t>
+      </w:r>
+    </w:p>
+    <w:p>
+      <w:pPr>
+        <w:pStyle w:val="ListParagraph"/>
+        <w:numPr>
+          <w:ilvl w:val="0"/>
+          <w:numId w:val="14"/>
+        </w:numPr>
+      </w:pPr>
+      <w:r>
+        <w:t>Middle:</w:t>
+      </w:r>
+      <w:r>
+        <w:t xml:space="preserve"> A radar chart</w:t>
+      </w:r>
+      <w:r>
+        <w:t xml:space="preserve"> </w:t>
+      </w:r>
+      <w:r>
+        <w:t>(a marketplace visual)</w:t>
+      </w:r>
+      <w:r>
+        <w:t xml:space="preserve"> showcasing </w:t>
+      </w:r>
+      <w:r>
+        <w:t xml:space="preserve">a selected player’s stats (Physicality, Defence, Pace, Shooting, Passing and Dribbling), </w:t>
+      </w:r>
+    </w:p>
+    <w:p>
+      <w:pPr>
+        <w:pStyle w:val="ListParagraph"/>
+        <w:numPr>
+          <w:ilvl w:val="0"/>
+          <w:numId w:val="14"/>
+        </w:numPr>
+      </w:pPr>
+      <w:r>
+        <w:t xml:space="preserve">Right: Cards displaying a player’s: </w:t>
+      </w:r>
+      <w:r>
+        <w:t>overall, potential, age, current value and wages.</w:t>
+      </w:r>
+    </w:p>
+    <w:p>
+      <w:r>
+        <w:t>A more in-depth view of any players who pique interest</w:t>
+      </w:r>
+      <w:r>
+        <w:t>, or to view the stats of any players in the club</w:t>
+      </w:r>
+    </w:p>
+    <w:p>
+      <w:pPr>
+        <w:rPr>
+          <w:b/>
+          <w:bCs/>
+          <w:sz w:val="28"/>
+          <w:szCs w:val="28"/>
+          <w:u w:val="single"/>
+        </w:rPr>
+      </w:pPr>
+    </w:p>
+    <w:p>
+      <w:pPr>
+        <w:rPr>
+          <w:b/>
+          <w:bCs/>
+          <w:sz w:val="28"/>
+          <w:szCs w:val="28"/>
+          <w:u w:val="single"/>
+        </w:rPr>
+      </w:pPr>
+    </w:p>
+    <w:p>
+      <w:pPr>
+        <w:rPr>
+          <w:b/>
+          <w:bCs/>
+          <w:sz w:val="28"/>
+          <w:szCs w:val="28"/>
+          <w:u w:val="single"/>
+        </w:rPr>
+      </w:pPr>
+    </w:p>
+    <w:p>
+      <w:pPr>
+        <w:rPr>
+          <w:b/>
+          <w:bCs/>
+          <w:sz w:val="28"/>
+          <w:szCs w:val="28"/>
+          <w:u w:val="single"/>
+        </w:rPr>
+      </w:pPr>
+    </w:p>
+    <w:p>
+      <w:pPr>
+        <w:rPr>
+          <w:b/>
+          <w:bCs/>
+          <w:sz w:val="28"/>
+          <w:szCs w:val="28"/>
+          <w:u w:val="single"/>
+        </w:rPr>
+      </w:pPr>
+    </w:p>
+    <w:p>
+      <w:pPr>
+        <w:rPr>
+          <w:b/>
+          <w:bCs/>
+          <w:sz w:val="28"/>
+          <w:szCs w:val="28"/>
+          <w:u w:val="single"/>
+        </w:rPr>
+      </w:pPr>
+    </w:p>
+    <w:p>
+      <w:pPr>
+        <w:rPr>
+          <w:b/>
+          <w:bCs/>
+          <w:sz w:val="28"/>
+          <w:szCs w:val="28"/>
+          <w:u w:val="single"/>
+        </w:rPr>
+      </w:pPr>
+    </w:p>
+    <w:p>
+      <w:pPr>
+        <w:rPr>
+          <w:b/>
+          <w:bCs/>
+          <w:sz w:val="28"/>
+          <w:szCs w:val="28"/>
+          <w:u w:val="single"/>
+        </w:rPr>
+      </w:pPr>
+    </w:p>
+    <w:p>
+      <w:r>
+        <w:rPr>
+          <w:b/>
+          <w:bCs/>
+          <w:sz w:val="28"/>
+          <w:szCs w:val="28"/>
+          <w:u w:val="single"/>
+        </w:rPr>
+        <w:lastRenderedPageBreak/>
+        <w:t>Undervalued Player Discovery</w:t>
+      </w:r>
+      <w:r>
+        <w:t xml:space="preserve"> </w:t>
+      </w:r>
+      <w:r>
+        <w:rPr>
+          <w:i/>
+          <w:iCs/>
+          <w:sz w:val="28"/>
+          <w:szCs w:val="28"/>
+        </w:rPr>
+        <w:t xml:space="preserve">– page </w:t>
+      </w:r>
+      <w:r>
+        <w:rPr>
+          <w:i/>
+          <w:iCs/>
+          <w:sz w:val="28"/>
+          <w:szCs w:val="28"/>
+        </w:rPr>
+        <w:t>6</w:t>
+      </w:r>
+    </w:p>
+    <w:p>
+      <w:pPr>
+        <w:rPr>
+          <w:b/>
+          <w:bCs/>
+          <w:sz w:val="28"/>
+          <w:szCs w:val="28"/>
+          <w:u w:val="single"/>
+        </w:rPr>
+      </w:pPr>
+      <w:r>
+        <w:rPr>
+          <w:b/>
+          <w:bCs/>
+          <w:sz w:val="28"/>
+          <w:szCs w:val="28"/>
+          <w:u w:val="single"/>
+        </w:rPr>
+        <w:drawing>
+          <wp:inline distT="0" distB="0" distL="0" distR="0" wp14:anchorId="437D9E82" wp14:editId="4737E1D3">
+            <wp:extent cx="5731510" cy="3244215"/>
+            <wp:effectExtent l="0" t="0" r="2540" b="0"/>
+            <wp:docPr id="1671517312" name="Picture 1"/>
+            <wp:cNvGraphicFramePr>
+              <a:graphicFrameLocks xmlns:a="http://schemas.openxmlformats.org/drawingml/2006/main" noChangeAspect="1"/>
+            </wp:cNvGraphicFramePr>
+            <a:graphic xmlns:a="http://schemas.openxmlformats.org/drawingml/2006/main">
+              <a:graphicData uri="http://schemas.openxmlformats.org/drawingml/2006/picture">
+                <pic:pic xmlns:pic="http://schemas.openxmlformats.org/drawingml/2006/picture">
+                  <pic:nvPicPr>
+                    <pic:cNvPr id="1671517312" name=""/>
+                    <pic:cNvPicPr/>
+                  </pic:nvPicPr>
+                  <pic:blipFill>
+                    <a:blip r:embed="rId24"/>
+                    <a:stretch>
+                      <a:fillRect/>
+                    </a:stretch>
+                  </pic:blipFill>
+                  <pic:spPr>
+                    <a:xfrm>
+                      <a:off x="0" y="0"/>
+                      <a:ext cx="5731510" cy="3244215"/>
+                    </a:xfrm>
+                    <a:prstGeom prst="rect">
+                      <a:avLst/>
+                    </a:prstGeom>
+                  </pic:spPr>
+                </pic:pic>
+              </a:graphicData>
+            </a:graphic>
+          </wp:inline>
+        </w:drawing>
+      </w:r>
+    </w:p>
+    <w:p>
+      <w:pPr>
+        <w:pStyle w:val="ListParagraph"/>
+        <w:numPr>
+          <w:ilvl w:val="0"/>
+          <w:numId w:val="17"/>
+        </w:numPr>
+      </w:pPr>
+      <w:r>
+        <w:t>Left: A slicer to filter the results of the visual by a player’s best position.</w:t>
+      </w:r>
+    </w:p>
+    <w:p>
+      <w:pPr>
+        <w:pStyle w:val="ListParagraph"/>
+        <w:numPr>
+          <w:ilvl w:val="0"/>
+          <w:numId w:val="17"/>
+        </w:numPr>
+      </w:pPr>
+      <w:r>
+        <w:t>Right: A scatter plot graph, with each point representing a player. It shows a player’s value against their overall. Each data point display’s a card with information about the player (Best position, age, value, wage, name, club, overall and other positions)</w:t>
+      </w:r>
+    </w:p>
+    <w:p>
+      <w:r>
+        <w:t>This visual is to discover any players that may be receiving a less than average compensation for their position and overall.</w:t>
+      </w:r>
+    </w:p>
+    <w:p/>
+    <w:p/>
+    <w:p/>
+    <w:p/>
+    <w:p/>
+    <w:p/>
+    <w:p/>
+    <w:p/>
+    <w:p/>
+    <w:p/>
+    <w:p/>
+    <w:p>
+      <w:r>
+        <w:rPr>
+          <w:b/>
+          <w:bCs/>
+          <w:sz w:val="28"/>
+          <w:szCs w:val="28"/>
+          <w:u w:val="single"/>
+        </w:rPr>
+        <w:lastRenderedPageBreak/>
+        <w:t>Player</w:t>
+      </w:r>
+      <w:r>
+        <w:rPr>
+          <w:b/>
+          <w:bCs/>
+          <w:sz w:val="28"/>
+          <w:szCs w:val="28"/>
+          <w:u w:val="single"/>
+        </w:rPr>
+        <w:t xml:space="preserve"> Contract Evaluation</w:t>
+      </w:r>
+      <w:r>
+        <w:t xml:space="preserve"> </w:t>
+      </w:r>
+      <w:r>
+        <w:rPr>
+          <w:i/>
+          <w:iCs/>
+          <w:sz w:val="28"/>
+          <w:szCs w:val="28"/>
+        </w:rPr>
+        <w:t xml:space="preserve">– page </w:t>
+      </w:r>
+      <w:r>
+        <w:rPr>
+          <w:i/>
+          <w:iCs/>
+          <w:sz w:val="28"/>
+          <w:szCs w:val="28"/>
+        </w:rPr>
+        <w:t>7</w:t>
+      </w:r>
+    </w:p>
+    <w:p>
+      <w:r>
+        <w:drawing>
+          <wp:inline distT="0" distB="0" distL="0" distR="0" wp14:anchorId="6A7ACCCD" wp14:editId="01811010">
+            <wp:extent cx="5731510" cy="3305810"/>
+            <wp:effectExtent l="0" t="0" r="2540" b="8890"/>
+            <wp:docPr id="2081066374" name="Picture 1"/>
+            <wp:cNvGraphicFramePr>
+              <a:graphicFrameLocks xmlns:a="http://schemas.openxmlformats.org/drawingml/2006/main" noChangeAspect="1"/>
+            </wp:cNvGraphicFramePr>
+            <a:graphic xmlns:a="http://schemas.openxmlformats.org/drawingml/2006/main">
+              <a:graphicData uri="http://schemas.openxmlformats.org/drawingml/2006/picture">
+                <pic:pic xmlns:pic="http://schemas.openxmlformats.org/drawingml/2006/picture">
+                  <pic:nvPicPr>
+                    <pic:cNvPr id="2081066374" name=""/>
+                    <pic:cNvPicPr/>
+                  </pic:nvPicPr>
+                  <pic:blipFill>
+                    <a:blip r:embed="rId25"/>
+                    <a:stretch>
+                      <a:fillRect/>
+                    </a:stretch>
+                  </pic:blipFill>
+                  <pic:spPr>
+                    <a:xfrm>
+                      <a:off x="0" y="0"/>
+                      <a:ext cx="5731510" cy="3305810"/>
+                    </a:xfrm>
+                    <a:prstGeom prst="rect">
+                      <a:avLst/>
+                    </a:prstGeom>
+                  </pic:spPr>
+                </pic:pic>
+              </a:graphicData>
+            </a:graphic>
+          </wp:inline>
+        </w:drawing>
+      </w:r>
+    </w:p>
+    <w:p>
+      <w:pPr>
+        <w:pStyle w:val="ListParagraph"/>
+        <w:numPr>
+          <w:ilvl w:val="0"/>
+          <w:numId w:val="18"/>
+        </w:numPr>
+        <w:tabs>
+          <w:tab w:val="left" w:pos="960"/>
+        </w:tabs>
+      </w:pPr>
+      <w:r>
+        <w:t>Top Left: A search bar (a marketplace visual) that can be used to find a specific player in the table</w:t>
+      </w:r>
+    </w:p>
+    <w:p>
+      <w:pPr>
+        <w:pStyle w:val="ListParagraph"/>
+        <w:numPr>
+          <w:ilvl w:val="0"/>
+          <w:numId w:val="18"/>
+        </w:numPr>
+        <w:tabs>
+          <w:tab w:val="left" w:pos="960"/>
+        </w:tabs>
+      </w:pPr>
+      <w:r>
+        <w:t>Middle-Top Right: A slicer/slider for player values</w:t>
+      </w:r>
+    </w:p>
+    <w:p>
+      <w:pPr>
+        <w:pStyle w:val="ListParagraph"/>
+        <w:numPr>
+          <w:ilvl w:val="0"/>
+          <w:numId w:val="18"/>
+        </w:numPr>
+        <w:tabs>
+          <w:tab w:val="left" w:pos="960"/>
+        </w:tabs>
+      </w:pPr>
+      <w:r>
+        <w:t>Right: A slicer to filter the table by a player’s position</w:t>
+      </w:r>
+    </w:p>
+    <w:p>
+      <w:pPr>
+        <w:pStyle w:val="ListParagraph"/>
+        <w:numPr>
+          <w:ilvl w:val="0"/>
+          <w:numId w:val="18"/>
+        </w:numPr>
+        <w:tabs>
+          <w:tab w:val="left" w:pos="960"/>
+        </w:tabs>
+      </w:pPr>
+      <w:r>
+        <w:t xml:space="preserve">Bottom: A table </w:t>
+      </w:r>
+      <w:r>
+        <w:t>showing a player's contract details (release clause, contract type, club, end year)</w:t>
+      </w:r>
+    </w:p>
+    <w:p>
+      <w:pPr>
+        <w:tabs>
+          <w:tab w:val="left" w:pos="960"/>
+        </w:tabs>
+      </w:pPr>
+      <w:r>
+        <w:t>Used to determine whether any prospective transfer can be acquired and the costs related to said transfer.</w:t>
+      </w:r>
     </w:p>
     <w:sectPr>
       <w:pgSz w:w="11906" w:h="16838"/>
@@ -2181,6 +3747,119 @@
 <file path=word/numbering.xml><?xml version="1.0" encoding="utf-8"?>
 <w:numbering xmlns:wpc="http://schemas.microsoft.com/office/word/2010/wordprocessingCanvas" xmlns:cx="http://schemas.microsoft.com/office/drawing/2014/chartex" xmlns:cx1="http://schemas.microsoft.com/office/drawing/2015/9/8/chartex" xmlns:cx2="http://schemas.microsoft.com/office/drawing/2015/10/21/chartex" xmlns:cx3="http://schemas.microsoft.com/office/drawing/2016/5/9/chartex" xmlns:cx4="http://schemas.microsoft.com/office/drawing/2016/5/10/chartex" xmlns:cx5="http://schemas.microsoft.com/office/drawing/2016/5/11/chartex" xmlns:cx6="http://schemas.microsoft.com/office/drawing/2016/5/12/chartex" xmlns:cx7="http://schemas.microsoft.com/office/drawing/2016/5/13/chartex" xmlns:cx8="http://schemas.microsoft.com/office/drawing/2016/5/14/chartex" xmlns:mc="http://schemas.openxmlformats.org/markup-compatibility/2006" xmlns:aink="http://schemas.microsoft.com/office/drawing/2016/ink" xmlns:am3d="http://schemas.microsoft.com/office/drawing/2017/model3d" xmlns:o="urn:schemas-microsoft-com:office:office" xmlns:oel="http://schemas.microsoft.com/office/2019/extlst" xmlns:r="http://schemas.openxmlformats.org/officeDocument/2006/relationships" xmlns:m="http://schemas.openxmlformats.org/officeDocument/2006/math" xmlns:v="urn:schemas-microsoft-com:vml" xmlns:wp14="http://schemas.microsoft.com/office/word/2010/wordprocessingDrawing" xmlns:wp="http://schemas.openxmlformats.org/drawingml/2006/wordprocessingDrawing" xmlns:w10="urn:schemas-microsoft-com:office:word" xmlns:w="http://schemas.openxmlformats.org/wordprocessingml/2006/main" xmlns:w14="http://schemas.microsoft.com/office/word/2010/wordml" xmlns:w15="http://schemas.microsoft.com/office/word/2012/wordml" xmlns:w16cei="http://schemas.microsoft.com/office/word/2026/wordml/cei" xmlns:w16cex="http://schemas.microsoft.com/office/word/2018/wordml/cex" xmlns:w16cid="http://schemas.microsoft.com/office/word/2016/wordml/cid" xmlns:w16="http://schemas.microsoft.com/office/word/2018/wordml" xmlns:w16du="http://schemas.microsoft.com/office/word/2023/wordml/word16du" xmlns:w16sdtdh="http://schemas.microsoft.com/office/word/2020/wordml/sdtdatahash" xmlns:w16sdtfl="http://schemas.microsoft.com/office/word/2024/wordml/sdtformatlock" xmlns:w16se="http://schemas.microsoft.com/office/word/2015/wordml/symex" xmlns:wpg="http://schemas.microsoft.com/office/word/2010/wordprocessingGroup" xmlns:wpi="http://schemas.microsoft.com/office/word/2010/wordprocessingInk" xmlns:wne="http://schemas.microsoft.com/office/word/2006/wordml" xmlns:wps="http://schemas.microsoft.com/office/word/2010/wordprocessingShape" mc:Ignorable="w14 w15 w16se w16cid w16 w16cex w16sdtdh w16sdtfl w16du wp14">
   <w:abstractNum w:abstractNumId="0" w15:restartNumberingAfterBreak="0">
+    <w:nsid w:val="00E860F3"/>
+    <w:multiLevelType w:val="hybridMultilevel"/>
+    <w:tmpl w:val="2C5E59B8"/>
+    <w:lvl w:ilvl="0" w:tplc="1C090001">
+      <w:start w:val="1"/>
+      <w:numFmt w:val="bullet"/>
+      <w:lvlText w:val=""/>
+      <w:lvlJc w:val="left"/>
+      <w:pPr>
+        <w:ind w:left="360" w:hanging="360"/>
+      </w:pPr>
+      <w:rPr>
+        <w:rFonts w:ascii="Symbol" w:hAnsi="Symbol" w:hint="default"/>
+      </w:rPr>
+    </w:lvl>
+    <w:lvl w:ilvl="1" w:tplc="1C090003" w:tentative="1">
+      <w:start w:val="1"/>
+      <w:numFmt w:val="bullet"/>
+      <w:lvlText w:val="o"/>
+      <w:lvlJc w:val="left"/>
+      <w:pPr>
+        <w:ind w:left="1080" w:hanging="360"/>
+      </w:pPr>
+      <w:rPr>
+        <w:rFonts w:ascii="Courier New" w:hAnsi="Courier New" w:cs="Courier New" w:hint="default"/>
+      </w:rPr>
+    </w:lvl>
+    <w:lvl w:ilvl="2" w:tplc="1C090005" w:tentative="1">
+      <w:start w:val="1"/>
+      <w:numFmt w:val="bullet"/>
+      <w:lvlText w:val=""/>
+      <w:lvlJc w:val="left"/>
+      <w:pPr>
+        <w:ind w:left="1800" w:hanging="360"/>
+      </w:pPr>
+      <w:rPr>
+        <w:rFonts w:ascii="Wingdings" w:hAnsi="Wingdings" w:hint="default"/>
+      </w:rPr>
+    </w:lvl>
+    <w:lvl w:ilvl="3" w:tplc="1C090001" w:tentative="1">
+      <w:start w:val="1"/>
+      <w:numFmt w:val="bullet"/>
+      <w:lvlText w:val=""/>
+      <w:lvlJc w:val="left"/>
+      <w:pPr>
+        <w:ind w:left="2520" w:hanging="360"/>
+      </w:pPr>
+      <w:rPr>
+        <w:rFonts w:ascii="Symbol" w:hAnsi="Symbol" w:hint="default"/>
+      </w:rPr>
+    </w:lvl>
+    <w:lvl w:ilvl="4" w:tplc="1C090003" w:tentative="1">
+      <w:start w:val="1"/>
+      <w:numFmt w:val="bullet"/>
+      <w:lvlText w:val="o"/>
+      <w:lvlJc w:val="left"/>
+      <w:pPr>
+        <w:ind w:left="3240" w:hanging="360"/>
+      </w:pPr>
+      <w:rPr>
+        <w:rFonts w:ascii="Courier New" w:hAnsi="Courier New" w:cs="Courier New" w:hint="default"/>
+      </w:rPr>
+    </w:lvl>
+    <w:lvl w:ilvl="5" w:tplc="1C090005" w:tentative="1">
+      <w:start w:val="1"/>
+      <w:numFmt w:val="bullet"/>
+      <w:lvlText w:val=""/>
+      <w:lvlJc w:val="left"/>
+      <w:pPr>
+        <w:ind w:left="3960" w:hanging="360"/>
+      </w:pPr>
+      <w:rPr>
+        <w:rFonts w:ascii="Wingdings" w:hAnsi="Wingdings" w:hint="default"/>
+      </w:rPr>
+    </w:lvl>
+    <w:lvl w:ilvl="6" w:tplc="1C090001" w:tentative="1">
+      <w:start w:val="1"/>
+      <w:numFmt w:val="bullet"/>
+      <w:lvlText w:val=""/>
+      <w:lvlJc w:val="left"/>
+      <w:pPr>
+        <w:ind w:left="4680" w:hanging="360"/>
+      </w:pPr>
+      <w:rPr>
+        <w:rFonts w:ascii="Symbol" w:hAnsi="Symbol" w:hint="default"/>
+      </w:rPr>
+    </w:lvl>
+    <w:lvl w:ilvl="7" w:tplc="1C090003" w:tentative="1">
+      <w:start w:val="1"/>
+      <w:numFmt w:val="bullet"/>
+      <w:lvlText w:val="o"/>
+      <w:lvlJc w:val="left"/>
+      <w:pPr>
+        <w:ind w:left="5400" w:hanging="360"/>
+      </w:pPr>
+      <w:rPr>
+        <w:rFonts w:ascii="Courier New" w:hAnsi="Courier New" w:cs="Courier New" w:hint="default"/>
+      </w:rPr>
+    </w:lvl>
+    <w:lvl w:ilvl="8" w:tplc="1C090005" w:tentative="1">
+      <w:start w:val="1"/>
+      <w:numFmt w:val="bullet"/>
+      <w:lvlText w:val=""/>
+      <w:lvlJc w:val="left"/>
+      <w:pPr>
+        <w:ind w:left="6120" w:hanging="360"/>
+      </w:pPr>
+      <w:rPr>
+        <w:rFonts w:ascii="Wingdings" w:hAnsi="Wingdings" w:hint="default"/>
+      </w:rPr>
+    </w:lvl>
+  </w:abstractNum>
+  <w:abstractNum w:abstractNumId="1" w15:restartNumberingAfterBreak="0">
     <w:nsid w:val="08500C76"/>
     <w:multiLevelType w:val="hybridMultilevel"/>
     <w:tmpl w:val="8A5689F8"/>
@@ -2269,7 +3948,7 @@
       </w:pPr>
     </w:lvl>
   </w:abstractNum>
-  <w:abstractNum w:abstractNumId="1" w15:restartNumberingAfterBreak="0">
+  <w:abstractNum w:abstractNumId="2" w15:restartNumberingAfterBreak="0">
     <w:nsid w:val="13A25F87"/>
     <w:multiLevelType w:val="hybridMultilevel"/>
     <w:tmpl w:val="A0BAB100"/>
@@ -2358,7 +4037,120 @@
       </w:pPr>
     </w:lvl>
   </w:abstractNum>
-  <w:abstractNum w:abstractNumId="2" w15:restartNumberingAfterBreak="0">
+  <w:abstractNum w:abstractNumId="3" w15:restartNumberingAfterBreak="0">
+    <w:nsid w:val="205B7DA3"/>
+    <w:multiLevelType w:val="hybridMultilevel"/>
+    <w:tmpl w:val="4A4E0386"/>
+    <w:lvl w:ilvl="0" w:tplc="1C090001">
+      <w:start w:val="1"/>
+      <w:numFmt w:val="bullet"/>
+      <w:lvlText w:val=""/>
+      <w:lvlJc w:val="left"/>
+      <w:pPr>
+        <w:ind w:left="360" w:hanging="360"/>
+      </w:pPr>
+      <w:rPr>
+        <w:rFonts w:ascii="Symbol" w:hAnsi="Symbol" w:hint="default"/>
+      </w:rPr>
+    </w:lvl>
+    <w:lvl w:ilvl="1" w:tplc="1C090003" w:tentative="1">
+      <w:start w:val="1"/>
+      <w:numFmt w:val="bullet"/>
+      <w:lvlText w:val="o"/>
+      <w:lvlJc w:val="left"/>
+      <w:pPr>
+        <w:ind w:left="1080" w:hanging="360"/>
+      </w:pPr>
+      <w:rPr>
+        <w:rFonts w:ascii="Courier New" w:hAnsi="Courier New" w:cs="Courier New" w:hint="default"/>
+      </w:rPr>
+    </w:lvl>
+    <w:lvl w:ilvl="2" w:tplc="1C090005" w:tentative="1">
+      <w:start w:val="1"/>
+      <w:numFmt w:val="bullet"/>
+      <w:lvlText w:val=""/>
+      <w:lvlJc w:val="left"/>
+      <w:pPr>
+        <w:ind w:left="1800" w:hanging="360"/>
+      </w:pPr>
+      <w:rPr>
+        <w:rFonts w:ascii="Wingdings" w:hAnsi="Wingdings" w:hint="default"/>
+      </w:rPr>
+    </w:lvl>
+    <w:lvl w:ilvl="3" w:tplc="1C090001" w:tentative="1">
+      <w:start w:val="1"/>
+      <w:numFmt w:val="bullet"/>
+      <w:lvlText w:val=""/>
+      <w:lvlJc w:val="left"/>
+      <w:pPr>
+        <w:ind w:left="2520" w:hanging="360"/>
+      </w:pPr>
+      <w:rPr>
+        <w:rFonts w:ascii="Symbol" w:hAnsi="Symbol" w:hint="default"/>
+      </w:rPr>
+    </w:lvl>
+    <w:lvl w:ilvl="4" w:tplc="1C090003" w:tentative="1">
+      <w:start w:val="1"/>
+      <w:numFmt w:val="bullet"/>
+      <w:lvlText w:val="o"/>
+      <w:lvlJc w:val="left"/>
+      <w:pPr>
+        <w:ind w:left="3240" w:hanging="360"/>
+      </w:pPr>
+      <w:rPr>
+        <w:rFonts w:ascii="Courier New" w:hAnsi="Courier New" w:cs="Courier New" w:hint="default"/>
+      </w:rPr>
+    </w:lvl>
+    <w:lvl w:ilvl="5" w:tplc="1C090005" w:tentative="1">
+      <w:start w:val="1"/>
+      <w:numFmt w:val="bullet"/>
+      <w:lvlText w:val=""/>
+      <w:lvlJc w:val="left"/>
+      <w:pPr>
+        <w:ind w:left="3960" w:hanging="360"/>
+      </w:pPr>
+      <w:rPr>
+        <w:rFonts w:ascii="Wingdings" w:hAnsi="Wingdings" w:hint="default"/>
+      </w:rPr>
+    </w:lvl>
+    <w:lvl w:ilvl="6" w:tplc="1C090001" w:tentative="1">
+      <w:start w:val="1"/>
+      <w:numFmt w:val="bullet"/>
+      <w:lvlText w:val=""/>
+      <w:lvlJc w:val="left"/>
+      <w:pPr>
+        <w:ind w:left="4680" w:hanging="360"/>
+      </w:pPr>
+      <w:rPr>
+        <w:rFonts w:ascii="Symbol" w:hAnsi="Symbol" w:hint="default"/>
+      </w:rPr>
+    </w:lvl>
+    <w:lvl w:ilvl="7" w:tplc="1C090003" w:tentative="1">
+      <w:start w:val="1"/>
+      <w:numFmt w:val="bullet"/>
+      <w:lvlText w:val="o"/>
+      <w:lvlJc w:val="left"/>
+      <w:pPr>
+        <w:ind w:left="5400" w:hanging="360"/>
+      </w:pPr>
+      <w:rPr>
+        <w:rFonts w:ascii="Courier New" w:hAnsi="Courier New" w:cs="Courier New" w:hint="default"/>
+      </w:rPr>
+    </w:lvl>
+    <w:lvl w:ilvl="8" w:tplc="1C090005" w:tentative="1">
+      <w:start w:val="1"/>
+      <w:numFmt w:val="bullet"/>
+      <w:lvlText w:val=""/>
+      <w:lvlJc w:val="left"/>
+      <w:pPr>
+        <w:ind w:left="6120" w:hanging="360"/>
+      </w:pPr>
+      <w:rPr>
+        <w:rFonts w:ascii="Wingdings" w:hAnsi="Wingdings" w:hint="default"/>
+      </w:rPr>
+    </w:lvl>
+  </w:abstractNum>
+  <w:abstractNum w:abstractNumId="4" w15:restartNumberingAfterBreak="0">
     <w:nsid w:val="22F55431"/>
     <w:multiLevelType w:val="hybridMultilevel"/>
     <w:tmpl w:val="66D46BC8"/>
@@ -2471,7 +4263,120 @@
       </w:rPr>
     </w:lvl>
   </w:abstractNum>
-  <w:abstractNum w:abstractNumId="3" w15:restartNumberingAfterBreak="0">
+  <w:abstractNum w:abstractNumId="5" w15:restartNumberingAfterBreak="0">
+    <w:nsid w:val="288B17E0"/>
+    <w:multiLevelType w:val="hybridMultilevel"/>
+    <w:tmpl w:val="324A9BAE"/>
+    <w:lvl w:ilvl="0" w:tplc="1C090001">
+      <w:start w:val="1"/>
+      <w:numFmt w:val="bullet"/>
+      <w:lvlText w:val=""/>
+      <w:lvlJc w:val="left"/>
+      <w:pPr>
+        <w:ind w:left="360" w:hanging="360"/>
+      </w:pPr>
+      <w:rPr>
+        <w:rFonts w:ascii="Symbol" w:hAnsi="Symbol" w:hint="default"/>
+      </w:rPr>
+    </w:lvl>
+    <w:lvl w:ilvl="1" w:tplc="1C090003" w:tentative="1">
+      <w:start w:val="1"/>
+      <w:numFmt w:val="bullet"/>
+      <w:lvlText w:val="o"/>
+      <w:lvlJc w:val="left"/>
+      <w:pPr>
+        <w:ind w:left="1080" w:hanging="360"/>
+      </w:pPr>
+      <w:rPr>
+        <w:rFonts w:ascii="Courier New" w:hAnsi="Courier New" w:cs="Courier New" w:hint="default"/>
+      </w:rPr>
+    </w:lvl>
+    <w:lvl w:ilvl="2" w:tplc="1C090005" w:tentative="1">
+      <w:start w:val="1"/>
+      <w:numFmt w:val="bullet"/>
+      <w:lvlText w:val=""/>
+      <w:lvlJc w:val="left"/>
+      <w:pPr>
+        <w:ind w:left="1800" w:hanging="360"/>
+      </w:pPr>
+      <w:rPr>
+        <w:rFonts w:ascii="Wingdings" w:hAnsi="Wingdings" w:hint="default"/>
+      </w:rPr>
+    </w:lvl>
+    <w:lvl w:ilvl="3" w:tplc="1C090001" w:tentative="1">
+      <w:start w:val="1"/>
+      <w:numFmt w:val="bullet"/>
+      <w:lvlText w:val=""/>
+      <w:lvlJc w:val="left"/>
+      <w:pPr>
+        <w:ind w:left="2520" w:hanging="360"/>
+      </w:pPr>
+      <w:rPr>
+        <w:rFonts w:ascii="Symbol" w:hAnsi="Symbol" w:hint="default"/>
+      </w:rPr>
+    </w:lvl>
+    <w:lvl w:ilvl="4" w:tplc="1C090003" w:tentative="1">
+      <w:start w:val="1"/>
+      <w:numFmt w:val="bullet"/>
+      <w:lvlText w:val="o"/>
+      <w:lvlJc w:val="left"/>
+      <w:pPr>
+        <w:ind w:left="3240" w:hanging="360"/>
+      </w:pPr>
+      <w:rPr>
+        <w:rFonts w:ascii="Courier New" w:hAnsi="Courier New" w:cs="Courier New" w:hint="default"/>
+      </w:rPr>
+    </w:lvl>
+    <w:lvl w:ilvl="5" w:tplc="1C090005" w:tentative="1">
+      <w:start w:val="1"/>
+      <w:numFmt w:val="bullet"/>
+      <w:lvlText w:val=""/>
+      <w:lvlJc w:val="left"/>
+      <w:pPr>
+        <w:ind w:left="3960" w:hanging="360"/>
+      </w:pPr>
+      <w:rPr>
+        <w:rFonts w:ascii="Wingdings" w:hAnsi="Wingdings" w:hint="default"/>
+      </w:rPr>
+    </w:lvl>
+    <w:lvl w:ilvl="6" w:tplc="1C090001" w:tentative="1">
+      <w:start w:val="1"/>
+      <w:numFmt w:val="bullet"/>
+      <w:lvlText w:val=""/>
+      <w:lvlJc w:val="left"/>
+      <w:pPr>
+        <w:ind w:left="4680" w:hanging="360"/>
+      </w:pPr>
+      <w:rPr>
+        <w:rFonts w:ascii="Symbol" w:hAnsi="Symbol" w:hint="default"/>
+      </w:rPr>
+    </w:lvl>
+    <w:lvl w:ilvl="7" w:tplc="1C090003" w:tentative="1">
+      <w:start w:val="1"/>
+      <w:numFmt w:val="bullet"/>
+      <w:lvlText w:val="o"/>
+      <w:lvlJc w:val="left"/>
+      <w:pPr>
+        <w:ind w:left="5400" w:hanging="360"/>
+      </w:pPr>
+      <w:rPr>
+        <w:rFonts w:ascii="Courier New" w:hAnsi="Courier New" w:cs="Courier New" w:hint="default"/>
+      </w:rPr>
+    </w:lvl>
+    <w:lvl w:ilvl="8" w:tplc="1C090005" w:tentative="1">
+      <w:start w:val="1"/>
+      <w:numFmt w:val="bullet"/>
+      <w:lvlText w:val=""/>
+      <w:lvlJc w:val="left"/>
+      <w:pPr>
+        <w:ind w:left="6120" w:hanging="360"/>
+      </w:pPr>
+      <w:rPr>
+        <w:rFonts w:ascii="Wingdings" w:hAnsi="Wingdings" w:hint="default"/>
+      </w:rPr>
+    </w:lvl>
+  </w:abstractNum>
+  <w:abstractNum w:abstractNumId="6" w15:restartNumberingAfterBreak="0">
     <w:nsid w:val="2D071AA5"/>
     <w:multiLevelType w:val="hybridMultilevel"/>
     <w:tmpl w:val="AEA0CD14"/>
@@ -2584,7 +4489,120 @@
       </w:rPr>
     </w:lvl>
   </w:abstractNum>
-  <w:abstractNum w:abstractNumId="4" w15:restartNumberingAfterBreak="0">
+  <w:abstractNum w:abstractNumId="7" w15:restartNumberingAfterBreak="0">
+    <w:nsid w:val="3CA40FA6"/>
+    <w:multiLevelType w:val="hybridMultilevel"/>
+    <w:tmpl w:val="181C4C10"/>
+    <w:lvl w:ilvl="0" w:tplc="1C090001">
+      <w:start w:val="1"/>
+      <w:numFmt w:val="bullet"/>
+      <w:lvlText w:val=""/>
+      <w:lvlJc w:val="left"/>
+      <w:pPr>
+        <w:ind w:left="360" w:hanging="360"/>
+      </w:pPr>
+      <w:rPr>
+        <w:rFonts w:ascii="Symbol" w:hAnsi="Symbol" w:hint="default"/>
+      </w:rPr>
+    </w:lvl>
+    <w:lvl w:ilvl="1" w:tplc="1C090003" w:tentative="1">
+      <w:start w:val="1"/>
+      <w:numFmt w:val="bullet"/>
+      <w:lvlText w:val="o"/>
+      <w:lvlJc w:val="left"/>
+      <w:pPr>
+        <w:ind w:left="1080" w:hanging="360"/>
+      </w:pPr>
+      <w:rPr>
+        <w:rFonts w:ascii="Courier New" w:hAnsi="Courier New" w:cs="Courier New" w:hint="default"/>
+      </w:rPr>
+    </w:lvl>
+    <w:lvl w:ilvl="2" w:tplc="1C090005" w:tentative="1">
+      <w:start w:val="1"/>
+      <w:numFmt w:val="bullet"/>
+      <w:lvlText w:val=""/>
+      <w:lvlJc w:val="left"/>
+      <w:pPr>
+        <w:ind w:left="1800" w:hanging="360"/>
+      </w:pPr>
+      <w:rPr>
+        <w:rFonts w:ascii="Wingdings" w:hAnsi="Wingdings" w:hint="default"/>
+      </w:rPr>
+    </w:lvl>
+    <w:lvl w:ilvl="3" w:tplc="1C090001" w:tentative="1">
+      <w:start w:val="1"/>
+      <w:numFmt w:val="bullet"/>
+      <w:lvlText w:val=""/>
+      <w:lvlJc w:val="left"/>
+      <w:pPr>
+        <w:ind w:left="2520" w:hanging="360"/>
+      </w:pPr>
+      <w:rPr>
+        <w:rFonts w:ascii="Symbol" w:hAnsi="Symbol" w:hint="default"/>
+      </w:rPr>
+    </w:lvl>
+    <w:lvl w:ilvl="4" w:tplc="1C090003" w:tentative="1">
+      <w:start w:val="1"/>
+      <w:numFmt w:val="bullet"/>
+      <w:lvlText w:val="o"/>
+      <w:lvlJc w:val="left"/>
+      <w:pPr>
+        <w:ind w:left="3240" w:hanging="360"/>
+      </w:pPr>
+      <w:rPr>
+        <w:rFonts w:ascii="Courier New" w:hAnsi="Courier New" w:cs="Courier New" w:hint="default"/>
+      </w:rPr>
+    </w:lvl>
+    <w:lvl w:ilvl="5" w:tplc="1C090005" w:tentative="1">
+      <w:start w:val="1"/>
+      <w:numFmt w:val="bullet"/>
+      <w:lvlText w:val=""/>
+      <w:lvlJc w:val="left"/>
+      <w:pPr>
+        <w:ind w:left="3960" w:hanging="360"/>
+      </w:pPr>
+      <w:rPr>
+        <w:rFonts w:ascii="Wingdings" w:hAnsi="Wingdings" w:hint="default"/>
+      </w:rPr>
+    </w:lvl>
+    <w:lvl w:ilvl="6" w:tplc="1C090001" w:tentative="1">
+      <w:start w:val="1"/>
+      <w:numFmt w:val="bullet"/>
+      <w:lvlText w:val=""/>
+      <w:lvlJc w:val="left"/>
+      <w:pPr>
+        <w:ind w:left="4680" w:hanging="360"/>
+      </w:pPr>
+      <w:rPr>
+        <w:rFonts w:ascii="Symbol" w:hAnsi="Symbol" w:hint="default"/>
+      </w:rPr>
+    </w:lvl>
+    <w:lvl w:ilvl="7" w:tplc="1C090003" w:tentative="1">
+      <w:start w:val="1"/>
+      <w:numFmt w:val="bullet"/>
+      <w:lvlText w:val="o"/>
+      <w:lvlJc w:val="left"/>
+      <w:pPr>
+        <w:ind w:left="5400" w:hanging="360"/>
+      </w:pPr>
+      <w:rPr>
+        <w:rFonts w:ascii="Courier New" w:hAnsi="Courier New" w:cs="Courier New" w:hint="default"/>
+      </w:rPr>
+    </w:lvl>
+    <w:lvl w:ilvl="8" w:tplc="1C090005" w:tentative="1">
+      <w:start w:val="1"/>
+      <w:numFmt w:val="bullet"/>
+      <w:lvlText w:val=""/>
+      <w:lvlJc w:val="left"/>
+      <w:pPr>
+        <w:ind w:left="6120" w:hanging="360"/>
+      </w:pPr>
+      <w:rPr>
+        <w:rFonts w:ascii="Wingdings" w:hAnsi="Wingdings" w:hint="default"/>
+      </w:rPr>
+    </w:lvl>
+  </w:abstractNum>
+  <w:abstractNum w:abstractNumId="8" w15:restartNumberingAfterBreak="0">
     <w:nsid w:val="44F24750"/>
     <w:multiLevelType w:val="hybridMultilevel"/>
     <w:tmpl w:val="8906432C"/>
@@ -2697,7 +4715,7 @@
       </w:rPr>
     </w:lvl>
   </w:abstractNum>
-  <w:abstractNum w:abstractNumId="5" w15:restartNumberingAfterBreak="0">
+  <w:abstractNum w:abstractNumId="9" w15:restartNumberingAfterBreak="0">
     <w:nsid w:val="49E816A2"/>
     <w:multiLevelType w:val="hybridMultilevel"/>
     <w:tmpl w:val="133A055E"/>
@@ -2810,7 +4828,7 @@
       </w:rPr>
     </w:lvl>
   </w:abstractNum>
-  <w:abstractNum w:abstractNumId="6" w15:restartNumberingAfterBreak="0">
+  <w:abstractNum w:abstractNumId="10" w15:restartNumberingAfterBreak="0">
     <w:nsid w:val="4BB067B8"/>
     <w:multiLevelType w:val="hybridMultilevel"/>
     <w:tmpl w:val="46209E26"/>
@@ -2923,10 +4941,10 @@
       </w:rPr>
     </w:lvl>
   </w:abstractNum>
-  <w:abstractNum w:abstractNumId="7" w15:restartNumberingAfterBreak="0">
+  <w:abstractNum w:abstractNumId="11" w15:restartNumberingAfterBreak="0">
     <w:nsid w:val="53F4091A"/>
     <w:multiLevelType w:val="hybridMultilevel"/>
-    <w:tmpl w:val="DFE611D4"/>
+    <w:tmpl w:val="19BA6FF8"/>
     <w:lvl w:ilvl="0" w:tplc="1C090001">
       <w:start w:val="1"/>
       <w:numFmt w:val="bullet"/>
@@ -3036,7 +5054,7 @@
       </w:rPr>
     </w:lvl>
   </w:abstractNum>
-  <w:abstractNum w:abstractNumId="8" w15:restartNumberingAfterBreak="0">
+  <w:abstractNum w:abstractNumId="12" w15:restartNumberingAfterBreak="0">
     <w:nsid w:val="55BB3326"/>
     <w:multiLevelType w:val="hybridMultilevel"/>
     <w:tmpl w:val="BA7474A8"/>
@@ -3125,7 +5143,7 @@
       </w:pPr>
     </w:lvl>
   </w:abstractNum>
-  <w:abstractNum w:abstractNumId="9" w15:restartNumberingAfterBreak="0">
+  <w:abstractNum w:abstractNumId="13" w15:restartNumberingAfterBreak="0">
     <w:nsid w:val="634047A8"/>
     <w:multiLevelType w:val="hybridMultilevel"/>
     <w:tmpl w:val="FC08871C"/>
@@ -3214,7 +5232,233 @@
       </w:pPr>
     </w:lvl>
   </w:abstractNum>
-  <w:abstractNum w:abstractNumId="10" w15:restartNumberingAfterBreak="0">
+  <w:abstractNum w:abstractNumId="14" w15:restartNumberingAfterBreak="0">
+    <w:nsid w:val="6DEE160A"/>
+    <w:multiLevelType w:val="hybridMultilevel"/>
+    <w:tmpl w:val="73B6AA92"/>
+    <w:lvl w:ilvl="0" w:tplc="1C090001">
+      <w:start w:val="1"/>
+      <w:numFmt w:val="bullet"/>
+      <w:lvlText w:val=""/>
+      <w:lvlJc w:val="left"/>
+      <w:pPr>
+        <w:ind w:left="360" w:hanging="360"/>
+      </w:pPr>
+      <w:rPr>
+        <w:rFonts w:ascii="Symbol" w:hAnsi="Symbol" w:hint="default"/>
+      </w:rPr>
+    </w:lvl>
+    <w:lvl w:ilvl="1" w:tplc="1C090003" w:tentative="1">
+      <w:start w:val="1"/>
+      <w:numFmt w:val="bullet"/>
+      <w:lvlText w:val="o"/>
+      <w:lvlJc w:val="left"/>
+      <w:pPr>
+        <w:ind w:left="1080" w:hanging="360"/>
+      </w:pPr>
+      <w:rPr>
+        <w:rFonts w:ascii="Courier New" w:hAnsi="Courier New" w:cs="Courier New" w:hint="default"/>
+      </w:rPr>
+    </w:lvl>
+    <w:lvl w:ilvl="2" w:tplc="1C090005" w:tentative="1">
+      <w:start w:val="1"/>
+      <w:numFmt w:val="bullet"/>
+      <w:lvlText w:val=""/>
+      <w:lvlJc w:val="left"/>
+      <w:pPr>
+        <w:ind w:left="1800" w:hanging="360"/>
+      </w:pPr>
+      <w:rPr>
+        <w:rFonts w:ascii="Wingdings" w:hAnsi="Wingdings" w:hint="default"/>
+      </w:rPr>
+    </w:lvl>
+    <w:lvl w:ilvl="3" w:tplc="1C090001" w:tentative="1">
+      <w:start w:val="1"/>
+      <w:numFmt w:val="bullet"/>
+      <w:lvlText w:val=""/>
+      <w:lvlJc w:val="left"/>
+      <w:pPr>
+        <w:ind w:left="2520" w:hanging="360"/>
+      </w:pPr>
+      <w:rPr>
+        <w:rFonts w:ascii="Symbol" w:hAnsi="Symbol" w:hint="default"/>
+      </w:rPr>
+    </w:lvl>
+    <w:lvl w:ilvl="4" w:tplc="1C090003" w:tentative="1">
+      <w:start w:val="1"/>
+      <w:numFmt w:val="bullet"/>
+      <w:lvlText w:val="o"/>
+      <w:lvlJc w:val="left"/>
+      <w:pPr>
+        <w:ind w:left="3240" w:hanging="360"/>
+      </w:pPr>
+      <w:rPr>
+        <w:rFonts w:ascii="Courier New" w:hAnsi="Courier New" w:cs="Courier New" w:hint="default"/>
+      </w:rPr>
+    </w:lvl>
+    <w:lvl w:ilvl="5" w:tplc="1C090005" w:tentative="1">
+      <w:start w:val="1"/>
+      <w:numFmt w:val="bullet"/>
+      <w:lvlText w:val=""/>
+      <w:lvlJc w:val="left"/>
+      <w:pPr>
+        <w:ind w:left="3960" w:hanging="360"/>
+      </w:pPr>
+      <w:rPr>
+        <w:rFonts w:ascii="Wingdings" w:hAnsi="Wingdings" w:hint="default"/>
+      </w:rPr>
+    </w:lvl>
+    <w:lvl w:ilvl="6" w:tplc="1C090001" w:tentative="1">
+      <w:start w:val="1"/>
+      <w:numFmt w:val="bullet"/>
+      <w:lvlText w:val=""/>
+      <w:lvlJc w:val="left"/>
+      <w:pPr>
+        <w:ind w:left="4680" w:hanging="360"/>
+      </w:pPr>
+      <w:rPr>
+        <w:rFonts w:ascii="Symbol" w:hAnsi="Symbol" w:hint="default"/>
+      </w:rPr>
+    </w:lvl>
+    <w:lvl w:ilvl="7" w:tplc="1C090003" w:tentative="1">
+      <w:start w:val="1"/>
+      <w:numFmt w:val="bullet"/>
+      <w:lvlText w:val="o"/>
+      <w:lvlJc w:val="left"/>
+      <w:pPr>
+        <w:ind w:left="5400" w:hanging="360"/>
+      </w:pPr>
+      <w:rPr>
+        <w:rFonts w:ascii="Courier New" w:hAnsi="Courier New" w:cs="Courier New" w:hint="default"/>
+      </w:rPr>
+    </w:lvl>
+    <w:lvl w:ilvl="8" w:tplc="1C090005" w:tentative="1">
+      <w:start w:val="1"/>
+      <w:numFmt w:val="bullet"/>
+      <w:lvlText w:val=""/>
+      <w:lvlJc w:val="left"/>
+      <w:pPr>
+        <w:ind w:left="6120" w:hanging="360"/>
+      </w:pPr>
+      <w:rPr>
+        <w:rFonts w:ascii="Wingdings" w:hAnsi="Wingdings" w:hint="default"/>
+      </w:rPr>
+    </w:lvl>
+  </w:abstractNum>
+  <w:abstractNum w:abstractNumId="15" w15:restartNumberingAfterBreak="0">
+    <w:nsid w:val="72404E31"/>
+    <w:multiLevelType w:val="hybridMultilevel"/>
+    <w:tmpl w:val="EB245564"/>
+    <w:lvl w:ilvl="0" w:tplc="1C090001">
+      <w:start w:val="1"/>
+      <w:numFmt w:val="bullet"/>
+      <w:lvlText w:val=""/>
+      <w:lvlJc w:val="left"/>
+      <w:pPr>
+        <w:ind w:left="360" w:hanging="360"/>
+      </w:pPr>
+      <w:rPr>
+        <w:rFonts w:ascii="Symbol" w:hAnsi="Symbol" w:hint="default"/>
+      </w:rPr>
+    </w:lvl>
+    <w:lvl w:ilvl="1" w:tplc="1C090003" w:tentative="1">
+      <w:start w:val="1"/>
+      <w:numFmt w:val="bullet"/>
+      <w:lvlText w:val="o"/>
+      <w:lvlJc w:val="left"/>
+      <w:pPr>
+        <w:ind w:left="1080" w:hanging="360"/>
+      </w:pPr>
+      <w:rPr>
+        <w:rFonts w:ascii="Courier New" w:hAnsi="Courier New" w:cs="Courier New" w:hint="default"/>
+      </w:rPr>
+    </w:lvl>
+    <w:lvl w:ilvl="2" w:tplc="1C090005" w:tentative="1">
+      <w:start w:val="1"/>
+      <w:numFmt w:val="bullet"/>
+      <w:lvlText w:val=""/>
+      <w:lvlJc w:val="left"/>
+      <w:pPr>
+        <w:ind w:left="1800" w:hanging="360"/>
+      </w:pPr>
+      <w:rPr>
+        <w:rFonts w:ascii="Wingdings" w:hAnsi="Wingdings" w:hint="default"/>
+      </w:rPr>
+    </w:lvl>
+    <w:lvl w:ilvl="3" w:tplc="1C090001" w:tentative="1">
+      <w:start w:val="1"/>
+      <w:numFmt w:val="bullet"/>
+      <w:lvlText w:val=""/>
+      <w:lvlJc w:val="left"/>
+      <w:pPr>
+        <w:ind w:left="2520" w:hanging="360"/>
+      </w:pPr>
+      <w:rPr>
+        <w:rFonts w:ascii="Symbol" w:hAnsi="Symbol" w:hint="default"/>
+      </w:rPr>
+    </w:lvl>
+    <w:lvl w:ilvl="4" w:tplc="1C090003" w:tentative="1">
+      <w:start w:val="1"/>
+      <w:numFmt w:val="bullet"/>
+      <w:lvlText w:val="o"/>
+      <w:lvlJc w:val="left"/>
+      <w:pPr>
+        <w:ind w:left="3240" w:hanging="360"/>
+      </w:pPr>
+      <w:rPr>
+        <w:rFonts w:ascii="Courier New" w:hAnsi="Courier New" w:cs="Courier New" w:hint="default"/>
+      </w:rPr>
+    </w:lvl>
+    <w:lvl w:ilvl="5" w:tplc="1C090005" w:tentative="1">
+      <w:start w:val="1"/>
+      <w:numFmt w:val="bullet"/>
+      <w:lvlText w:val=""/>
+      <w:lvlJc w:val="left"/>
+      <w:pPr>
+        <w:ind w:left="3960" w:hanging="360"/>
+      </w:pPr>
+      <w:rPr>
+        <w:rFonts w:ascii="Wingdings" w:hAnsi="Wingdings" w:hint="default"/>
+      </w:rPr>
+    </w:lvl>
+    <w:lvl w:ilvl="6" w:tplc="1C090001" w:tentative="1">
+      <w:start w:val="1"/>
+      <w:numFmt w:val="bullet"/>
+      <w:lvlText w:val=""/>
+      <w:lvlJc w:val="left"/>
+      <w:pPr>
+        <w:ind w:left="4680" w:hanging="360"/>
+      </w:pPr>
+      <w:rPr>
+        <w:rFonts w:ascii="Symbol" w:hAnsi="Symbol" w:hint="default"/>
+      </w:rPr>
+    </w:lvl>
+    <w:lvl w:ilvl="7" w:tplc="1C090003" w:tentative="1">
+      <w:start w:val="1"/>
+      <w:numFmt w:val="bullet"/>
+      <w:lvlText w:val="o"/>
+      <w:lvlJc w:val="left"/>
+      <w:pPr>
+        <w:ind w:left="5400" w:hanging="360"/>
+      </w:pPr>
+      <w:rPr>
+        <w:rFonts w:ascii="Courier New" w:hAnsi="Courier New" w:cs="Courier New" w:hint="default"/>
+      </w:rPr>
+    </w:lvl>
+    <w:lvl w:ilvl="8" w:tplc="1C090005" w:tentative="1">
+      <w:start w:val="1"/>
+      <w:numFmt w:val="bullet"/>
+      <w:lvlText w:val=""/>
+      <w:lvlJc w:val="left"/>
+      <w:pPr>
+        <w:ind w:left="6120" w:hanging="360"/>
+      </w:pPr>
+      <w:rPr>
+        <w:rFonts w:ascii="Wingdings" w:hAnsi="Wingdings" w:hint="default"/>
+      </w:rPr>
+    </w:lvl>
+  </w:abstractNum>
+  <w:abstractNum w:abstractNumId="16" w15:restartNumberingAfterBreak="0">
     <w:nsid w:val="76B96742"/>
     <w:multiLevelType w:val="hybridMultilevel"/>
     <w:tmpl w:val="8EDC1100"/>
@@ -3303,38 +5547,172 @@
       </w:pPr>
     </w:lvl>
   </w:abstractNum>
+  <w:abstractNum w:abstractNumId="17" w15:restartNumberingAfterBreak="0">
+    <w:nsid w:val="781F03DB"/>
+    <w:multiLevelType w:val="hybridMultilevel"/>
+    <w:tmpl w:val="0AAA7788"/>
+    <w:lvl w:ilvl="0" w:tplc="1C090001">
+      <w:start w:val="1"/>
+      <w:numFmt w:val="bullet"/>
+      <w:lvlText w:val=""/>
+      <w:lvlJc w:val="left"/>
+      <w:pPr>
+        <w:ind w:left="360" w:hanging="360"/>
+      </w:pPr>
+      <w:rPr>
+        <w:rFonts w:ascii="Symbol" w:hAnsi="Symbol" w:hint="default"/>
+      </w:rPr>
+    </w:lvl>
+    <w:lvl w:ilvl="1" w:tplc="1C090003" w:tentative="1">
+      <w:start w:val="1"/>
+      <w:numFmt w:val="bullet"/>
+      <w:lvlText w:val="o"/>
+      <w:lvlJc w:val="left"/>
+      <w:pPr>
+        <w:ind w:left="1080" w:hanging="360"/>
+      </w:pPr>
+      <w:rPr>
+        <w:rFonts w:ascii="Courier New" w:hAnsi="Courier New" w:cs="Courier New" w:hint="default"/>
+      </w:rPr>
+    </w:lvl>
+    <w:lvl w:ilvl="2" w:tplc="1C090005" w:tentative="1">
+      <w:start w:val="1"/>
+      <w:numFmt w:val="bullet"/>
+      <w:lvlText w:val=""/>
+      <w:lvlJc w:val="left"/>
+      <w:pPr>
+        <w:ind w:left="1800" w:hanging="360"/>
+      </w:pPr>
+      <w:rPr>
+        <w:rFonts w:ascii="Wingdings" w:hAnsi="Wingdings" w:hint="default"/>
+      </w:rPr>
+    </w:lvl>
+    <w:lvl w:ilvl="3" w:tplc="1C090001" w:tentative="1">
+      <w:start w:val="1"/>
+      <w:numFmt w:val="bullet"/>
+      <w:lvlText w:val=""/>
+      <w:lvlJc w:val="left"/>
+      <w:pPr>
+        <w:ind w:left="2520" w:hanging="360"/>
+      </w:pPr>
+      <w:rPr>
+        <w:rFonts w:ascii="Symbol" w:hAnsi="Symbol" w:hint="default"/>
+      </w:rPr>
+    </w:lvl>
+    <w:lvl w:ilvl="4" w:tplc="1C090003" w:tentative="1">
+      <w:start w:val="1"/>
+      <w:numFmt w:val="bullet"/>
+      <w:lvlText w:val="o"/>
+      <w:lvlJc w:val="left"/>
+      <w:pPr>
+        <w:ind w:left="3240" w:hanging="360"/>
+      </w:pPr>
+      <w:rPr>
+        <w:rFonts w:ascii="Courier New" w:hAnsi="Courier New" w:cs="Courier New" w:hint="default"/>
+      </w:rPr>
+    </w:lvl>
+    <w:lvl w:ilvl="5" w:tplc="1C090005" w:tentative="1">
+      <w:start w:val="1"/>
+      <w:numFmt w:val="bullet"/>
+      <w:lvlText w:val=""/>
+      <w:lvlJc w:val="left"/>
+      <w:pPr>
+        <w:ind w:left="3960" w:hanging="360"/>
+      </w:pPr>
+      <w:rPr>
+        <w:rFonts w:ascii="Wingdings" w:hAnsi="Wingdings" w:hint="default"/>
+      </w:rPr>
+    </w:lvl>
+    <w:lvl w:ilvl="6" w:tplc="1C090001" w:tentative="1">
+      <w:start w:val="1"/>
+      <w:numFmt w:val="bullet"/>
+      <w:lvlText w:val=""/>
+      <w:lvlJc w:val="left"/>
+      <w:pPr>
+        <w:ind w:left="4680" w:hanging="360"/>
+      </w:pPr>
+      <w:rPr>
+        <w:rFonts w:ascii="Symbol" w:hAnsi="Symbol" w:hint="default"/>
+      </w:rPr>
+    </w:lvl>
+    <w:lvl w:ilvl="7" w:tplc="1C090003" w:tentative="1">
+      <w:start w:val="1"/>
+      <w:numFmt w:val="bullet"/>
+      <w:lvlText w:val="o"/>
+      <w:lvlJc w:val="left"/>
+      <w:pPr>
+        <w:ind w:left="5400" w:hanging="360"/>
+      </w:pPr>
+      <w:rPr>
+        <w:rFonts w:ascii="Courier New" w:hAnsi="Courier New" w:cs="Courier New" w:hint="default"/>
+      </w:rPr>
+    </w:lvl>
+    <w:lvl w:ilvl="8" w:tplc="1C090005" w:tentative="1">
+      <w:start w:val="1"/>
+      <w:numFmt w:val="bullet"/>
+      <w:lvlText w:val=""/>
+      <w:lvlJc w:val="left"/>
+      <w:pPr>
+        <w:ind w:left="6120" w:hanging="360"/>
+      </w:pPr>
+      <w:rPr>
+        <w:rFonts w:ascii="Wingdings" w:hAnsi="Wingdings" w:hint="default"/>
+      </w:rPr>
+    </w:lvl>
+  </w:abstractNum>
   <w:num w:numId="1" w16cid:durableId="1501431280">
+    <w:abstractNumId w:val="13"/>
+  </w:num>
+  <w:num w:numId="2" w16cid:durableId="163590218">
+    <w:abstractNumId w:val="16"/>
+  </w:num>
+  <w:num w:numId="3" w16cid:durableId="1022703837">
+    <w:abstractNumId w:val="1"/>
+  </w:num>
+  <w:num w:numId="4" w16cid:durableId="1299803201">
+    <w:abstractNumId w:val="12"/>
+  </w:num>
+  <w:num w:numId="5" w16cid:durableId="2037344588">
+    <w:abstractNumId w:val="2"/>
+  </w:num>
+  <w:num w:numId="6" w16cid:durableId="54276320">
+    <w:abstractNumId w:val="6"/>
+  </w:num>
+  <w:num w:numId="7" w16cid:durableId="513887802">
     <w:abstractNumId w:val="9"/>
   </w:num>
-  <w:num w:numId="2" w16cid:durableId="163590218">
+  <w:num w:numId="8" w16cid:durableId="1509174241">
+    <w:abstractNumId w:val="4"/>
+  </w:num>
+  <w:num w:numId="9" w16cid:durableId="673532577">
     <w:abstractNumId w:val="10"/>
   </w:num>
-  <w:num w:numId="3" w16cid:durableId="1022703837">
+  <w:num w:numId="10" w16cid:durableId="530995698">
+    <w:abstractNumId w:val="8"/>
+  </w:num>
+  <w:num w:numId="11" w16cid:durableId="172381094">
+    <w:abstractNumId w:val="11"/>
+  </w:num>
+  <w:num w:numId="12" w16cid:durableId="772240372">
+    <w:abstractNumId w:val="5"/>
+  </w:num>
+  <w:num w:numId="13" w16cid:durableId="186215778">
+    <w:abstractNumId w:val="3"/>
+  </w:num>
+  <w:num w:numId="14" w16cid:durableId="1366758393">
+    <w:abstractNumId w:val="17"/>
+  </w:num>
+  <w:num w:numId="15" w16cid:durableId="687489256">
+    <w:abstractNumId w:val="7"/>
+  </w:num>
+  <w:num w:numId="16" w16cid:durableId="573979798">
     <w:abstractNumId w:val="0"/>
   </w:num>
-  <w:num w:numId="4" w16cid:durableId="1299803201">
-    <w:abstractNumId w:val="8"/>
+  <w:num w:numId="17" w16cid:durableId="1137917087">
+    <w:abstractNumId w:val="14"/>
   </w:num>
-  <w:num w:numId="5" w16cid:durableId="2037344588">
-    <w:abstractNumId w:val="1"/>
-  </w:num>
-  <w:num w:numId="6" w16cid:durableId="54276320">
-    <w:abstractNumId w:val="3"/>
-  </w:num>
-  <w:num w:numId="7" w16cid:durableId="513887802">
-    <w:abstractNumId w:val="5"/>
-  </w:num>
-  <w:num w:numId="8" w16cid:durableId="1509174241">
-    <w:abstractNumId w:val="2"/>
-  </w:num>
-  <w:num w:numId="9" w16cid:durableId="673532577">
-    <w:abstractNumId w:val="6"/>
-  </w:num>
-  <w:num w:numId="10" w16cid:durableId="530995698">
-    <w:abstractNumId w:val="4"/>
-  </w:num>
-  <w:num w:numId="11" w16cid:durableId="172381094">
-    <w:abstractNumId w:val="7"/>
+  <w:num w:numId="18" w16cid:durableId="212431161">
+    <w:abstractNumId w:val="15"/>
   </w:num>
 </w:numbering>
 </file>

</xml_diff>